<commit_message>
Clean E coli model comparison notebook
</commit_message>
<xml_diff>
--- a/Θεωρητικό Μέρος.docx
+++ b/Θεωρητικό Μέρος.docx
@@ -2,6 +2,2527 @@
 <file path=word/document.xml><?xml version="1.0" encoding="utf-8"?>
 <w:document xmlns:wpc="http://schemas.microsoft.com/office/word/2010/wordprocessingCanvas" xmlns:cx="http://schemas.microsoft.com/office/drawing/2014/chartex" xmlns:cx1="http://schemas.microsoft.com/office/drawing/2015/9/8/chartex" xmlns:cx2="http://schemas.microsoft.com/office/drawing/2015/10/21/chartex" xmlns:cx3="http://schemas.microsoft.com/office/drawing/2016/5/9/chartex" xmlns:cx4="http://schemas.microsoft.com/office/drawing/2016/5/10/chartex" xmlns:cx5="http://schemas.microsoft.com/office/drawing/2016/5/11/chartex" xmlns:cx6="http://schemas.microsoft.com/office/drawing/2016/5/12/chartex" xmlns:cx7="http://schemas.microsoft.com/office/drawing/2016/5/13/chartex" xmlns:cx8="http://schemas.microsoft.com/office/drawing/2016/5/14/chartex" xmlns:mc="http://schemas.openxmlformats.org/markup-compatibility/2006" xmlns:aink="http://schemas.microsoft.com/office/drawing/2016/ink" xmlns:am3d="http://schemas.microsoft.com/office/drawing/2017/model3d" xmlns:o="urn:schemas-microsoft-com:office:office" xmlns:oel="http://schemas.microsoft.com/office/2019/extlst" xmlns:r="http://schemas.openxmlformats.org/officeDocument/2006/relationships" xmlns:m="http://schemas.openxmlformats.org/officeDocument/2006/math" xmlns:v="urn:schemas-microsoft-com:vml" xmlns:wp14="http://schemas.microsoft.com/office/word/2010/wordprocessingDrawing" xmlns:wp="http://schemas.openxmlformats.org/drawingml/2006/wordprocessingDrawing" xmlns:w10="urn:schemas-microsoft-com:office:word" xmlns:w="http://schemas.openxmlformats.org/wordprocessingml/2006/main" xmlns:w14="http://schemas.microsoft.com/office/word/2010/wordml" xmlns:w15="http://schemas.microsoft.com/office/word/2012/wordml" xmlns:w16cex="http://schemas.microsoft.com/office/word/2018/wordml/cex" xmlns:w16cid="http://schemas.microsoft.com/office/word/2016/wordml/cid" xmlns:w16="http://schemas.microsoft.com/office/word/2018/wordml" xmlns:w16du="http://schemas.microsoft.com/office/word/2023/wordml/word16du" xmlns:w16sdtdh="http://schemas.microsoft.com/office/word/2020/wordml/sdtdatahash" xmlns:w16sdtfl="http://schemas.microsoft.com/office/word/2024/wordml/sdtformatlock" xmlns:w16se="http://schemas.microsoft.com/office/word/2015/wordml/symex" xmlns:wpg="http://schemas.microsoft.com/office/word/2010/wordprocessingGroup" xmlns:wpi="http://schemas.microsoft.com/office/word/2010/wordprocessingInk" xmlns:wne="http://schemas.microsoft.com/office/word/2006/wordml" xmlns:wps="http://schemas.microsoft.com/office/word/2010/wordprocessingShape" mc:Ignorable="w14 w15 w16se w16cid w16 w16cex w16sdtdh w16sdtfl w16du wp14">
   <w:body>
+    <w:sdt>
+      <w:sdtPr>
+        <w:rPr>
+          <w:rFonts w:asciiTheme="majorHAnsi" w:hAnsiTheme="majorHAnsi" w:cstheme="majorHAnsi"/>
+        </w:rPr>
+        <w:id w:val="-1742855866"/>
+        <w:docPartObj>
+          <w:docPartGallery w:val="Cover Pages"/>
+          <w:docPartUnique/>
+        </w:docPartObj>
+      </w:sdtPr>
+      <w:sdtEndPr>
+        <w:rPr>
+          <w:lang w:val="el-GR"/>
+        </w:rPr>
+      </w:sdtEndPr>
+      <w:sdtContent>
+        <w:p>
+          <w:pPr>
+            <w:jc w:val="center"/>
+            <w:rPr>
+              <w:rFonts w:asciiTheme="majorHAnsi" w:hAnsiTheme="majorHAnsi" w:cstheme="majorHAnsi"/>
+            </w:rPr>
+          </w:pPr>
+          <w:r>
+            <w:rPr>
+              <w:rFonts w:asciiTheme="majorHAnsi" w:hAnsiTheme="majorHAnsi" w:cstheme="majorHAnsi"/>
+              <w:noProof/>
+              <w:lang w:val="el-GR"/>
+            </w:rPr>
+            <w:drawing>
+              <wp:inline distT="0" distB="0" distL="0" distR="0" wp14:anchorId="426CC75D" wp14:editId="622914FF">
+                <wp:extent cx="1645920" cy="1429092"/>
+                <wp:effectExtent l="0" t="0" r="0" b="0"/>
+                <wp:docPr id="1466549827" name="Picture 4"/>
+                <wp:cNvGraphicFramePr>
+                  <a:graphicFrameLocks xmlns:a="http://schemas.openxmlformats.org/drawingml/2006/main" noChangeAspect="1"/>
+                </wp:cNvGraphicFramePr>
+                <a:graphic xmlns:a="http://schemas.openxmlformats.org/drawingml/2006/main">
+                  <a:graphicData uri="http://schemas.openxmlformats.org/drawingml/2006/picture">
+                    <pic:pic xmlns:pic="http://schemas.openxmlformats.org/drawingml/2006/picture">
+                      <pic:nvPicPr>
+                        <pic:cNvPr id="0" name="Picture 3"/>
+                        <pic:cNvPicPr>
+                          <a:picLocks noChangeAspect="1" noChangeArrowheads="1"/>
+                        </pic:cNvPicPr>
+                      </pic:nvPicPr>
+                      <pic:blipFill rotWithShape="1">
+                        <a:blip r:embed="rId8">
+                          <a:extLst>
+                            <a:ext uri="{28A0092B-C50C-407E-A947-70E740481C1C}">
+                              <a14:useLocalDpi xmlns:a14="http://schemas.microsoft.com/office/drawing/2010/main" val="0"/>
+                            </a:ext>
+                          </a:extLst>
+                        </a:blip>
+                        <a:srcRect l="12698" t="8478" r="16614" b="9573"/>
+                        <a:stretch>
+                          <a:fillRect/>
+                        </a:stretch>
+                      </pic:blipFill>
+                      <pic:spPr bwMode="auto">
+                        <a:xfrm>
+                          <a:off x="0" y="0"/>
+                          <a:ext cx="1664675" cy="1445376"/>
+                        </a:xfrm>
+                        <a:prstGeom prst="rect">
+                          <a:avLst/>
+                        </a:prstGeom>
+                        <a:noFill/>
+                        <a:ln>
+                          <a:noFill/>
+                        </a:ln>
+                        <a:extLst>
+                          <a:ext uri="{53640926-AAD7-44D8-BBD7-CCE9431645EC}">
+                            <a14:shadowObscured xmlns:a14="http://schemas.microsoft.com/office/drawing/2010/main"/>
+                          </a:ext>
+                        </a:extLst>
+                      </pic:spPr>
+                    </pic:pic>
+                  </a:graphicData>
+                </a:graphic>
+              </wp:inline>
+            </w:drawing>
+          </w:r>
+          <w:r>
+            <w:rPr>
+              <w:rFonts w:asciiTheme="majorHAnsi" w:hAnsiTheme="majorHAnsi" w:cstheme="majorHAnsi"/>
+            </w:rPr>
+            <w:t xml:space="preserve"> </w:t>
+          </w:r>
+          <w:r>
+            <w:rPr>
+              <w:rFonts w:asciiTheme="majorHAnsi" w:hAnsiTheme="majorHAnsi" w:cstheme="majorHAnsi"/>
+              <w:noProof/>
+            </w:rPr>
+            <w:drawing>
+              <wp:inline distT="0" distB="0" distL="0" distR="0" wp14:anchorId="2133F7EF" wp14:editId="100FD683">
+                <wp:extent cx="1722120" cy="1470660"/>
+                <wp:effectExtent l="0" t="0" r="0" b="0"/>
+                <wp:docPr id="2120662284" name="Picture 5" descr="Τμήμα Μοριακής Βιολογίας &amp; Γενετικής"/>
+                <wp:cNvGraphicFramePr>
+                  <a:graphicFrameLocks xmlns:a="http://schemas.openxmlformats.org/drawingml/2006/main" noChangeAspect="1"/>
+                </wp:cNvGraphicFramePr>
+                <a:graphic xmlns:a="http://schemas.openxmlformats.org/drawingml/2006/main">
+                  <a:graphicData uri="http://schemas.openxmlformats.org/drawingml/2006/picture">
+                    <pic:pic xmlns:pic="http://schemas.openxmlformats.org/drawingml/2006/picture">
+                      <pic:nvPicPr>
+                        <pic:cNvPr id="0" name="Picture 13" descr="Τμήμα Μοριακής Βιολογίας &amp; Γενετικής"/>
+                        <pic:cNvPicPr>
+                          <a:picLocks noChangeAspect="1" noChangeArrowheads="1"/>
+                        </pic:cNvPicPr>
+                      </pic:nvPicPr>
+                      <pic:blipFill>
+                        <a:blip r:embed="rId9">
+                          <a:extLst>
+                            <a:ext uri="{28A0092B-C50C-407E-A947-70E740481C1C}">
+                              <a14:useLocalDpi xmlns:a14="http://schemas.microsoft.com/office/drawing/2010/main" val="0"/>
+                            </a:ext>
+                          </a:extLst>
+                        </a:blip>
+                        <a:srcRect/>
+                        <a:stretch>
+                          <a:fillRect/>
+                        </a:stretch>
+                      </pic:blipFill>
+                      <pic:spPr bwMode="auto">
+                        <a:xfrm>
+                          <a:off x="0" y="0"/>
+                          <a:ext cx="1722120" cy="1470660"/>
+                        </a:xfrm>
+                        <a:prstGeom prst="rect">
+                          <a:avLst/>
+                        </a:prstGeom>
+                        <a:noFill/>
+                        <a:ln>
+                          <a:noFill/>
+                        </a:ln>
+                      </pic:spPr>
+                    </pic:pic>
+                  </a:graphicData>
+                </a:graphic>
+              </wp:inline>
+            </w:drawing>
+          </w:r>
+        </w:p>
+        <w:p>
+          <w:pPr>
+            <w:tabs>
+              <w:tab w:val="left" w:pos="1308"/>
+            </w:tabs>
+            <w:spacing w:after="200" w:line="276" w:lineRule="auto"/>
+            <w:ind w:firstLine="0"/>
+            <w:jc w:val="center"/>
+            <w:rPr>
+              <w:rFonts w:asciiTheme="majorHAnsi" w:hAnsiTheme="majorHAnsi" w:cstheme="majorHAnsi"/>
+              <w:color w:val="000000" w:themeColor="text1"/>
+              <w:lang w:val="el-GR"/>
+            </w:rPr>
+          </w:pPr>
+          <w:r>
+            <w:rPr>
+              <w:rFonts w:asciiTheme="majorHAnsi" w:hAnsiTheme="majorHAnsi" w:cstheme="majorHAnsi"/>
+              <w:color w:val="000000" w:themeColor="text1"/>
+              <w:lang w:val="el-GR"/>
+            </w:rPr>
+            <w:t>ΔΗΜΟΚΡΙΤΕΙΟ ΠΑΝΕΠΙΣΤΗΜΙΟ ΘΡΑΚΗΣ</w:t>
+          </w:r>
+        </w:p>
+        <w:p>
+          <w:pPr>
+            <w:tabs>
+              <w:tab w:val="left" w:pos="1308"/>
+            </w:tabs>
+            <w:spacing w:after="200" w:line="276" w:lineRule="auto"/>
+            <w:ind w:firstLine="0"/>
+            <w:jc w:val="center"/>
+            <w:rPr>
+              <w:rFonts w:asciiTheme="majorHAnsi" w:hAnsiTheme="majorHAnsi" w:cstheme="majorHAnsi"/>
+              <w:color w:val="000000" w:themeColor="text1"/>
+              <w:lang w:val="el-GR"/>
+            </w:rPr>
+          </w:pPr>
+          <w:r>
+            <w:rPr>
+              <w:rFonts w:asciiTheme="majorHAnsi" w:hAnsiTheme="majorHAnsi" w:cstheme="majorHAnsi"/>
+              <w:color w:val="000000" w:themeColor="text1"/>
+              <w:lang w:val="el-GR"/>
+            </w:rPr>
+            <w:t>ΣΧΟΛΗ ΕΠΙΣΤΗΜΩΝ ΥΓΕΙΑΣ</w:t>
+          </w:r>
+        </w:p>
+        <w:p>
+          <w:pPr>
+            <w:tabs>
+              <w:tab w:val="left" w:pos="1308"/>
+            </w:tabs>
+            <w:spacing w:after="200" w:line="276" w:lineRule="auto"/>
+            <w:ind w:firstLine="0"/>
+            <w:jc w:val="center"/>
+            <w:rPr>
+              <w:rFonts w:asciiTheme="majorHAnsi" w:hAnsiTheme="majorHAnsi" w:cstheme="majorHAnsi"/>
+              <w:color w:val="000000" w:themeColor="text1"/>
+              <w:lang w:val="el-GR"/>
+            </w:rPr>
+          </w:pPr>
+          <w:r>
+            <w:rPr>
+              <w:rFonts w:asciiTheme="majorHAnsi" w:hAnsiTheme="majorHAnsi" w:cstheme="majorHAnsi"/>
+              <w:color w:val="000000" w:themeColor="text1"/>
+              <w:lang w:val="el-GR"/>
+            </w:rPr>
+            <w:t>ΤΜΗΜΑ ΜΟΡΙΑΚΗΣ ΒΙΟΛΟΓΙΑΣ ΚΑΙ ΓΕΝΕΤΙΚΗΣ</w:t>
+          </w:r>
+        </w:p>
+        <w:p>
+          <w:pPr>
+            <w:tabs>
+              <w:tab w:val="left" w:pos="1308"/>
+            </w:tabs>
+            <w:spacing w:after="200" w:line="276" w:lineRule="auto"/>
+            <w:ind w:firstLine="0"/>
+            <w:jc w:val="center"/>
+            <w:rPr>
+              <w:rFonts w:asciiTheme="majorHAnsi" w:hAnsiTheme="majorHAnsi" w:cstheme="majorHAnsi"/>
+              <w:color w:val="000000" w:themeColor="text1"/>
+              <w:lang w:val="el-GR"/>
+            </w:rPr>
+          </w:pPr>
+        </w:p>
+        <w:p>
+          <w:pPr>
+            <w:tabs>
+              <w:tab w:val="left" w:pos="1308"/>
+            </w:tabs>
+            <w:spacing w:after="200" w:line="276" w:lineRule="auto"/>
+            <w:ind w:firstLine="0"/>
+            <w:jc w:val="center"/>
+            <w:rPr>
+              <w:rFonts w:asciiTheme="majorHAnsi" w:hAnsiTheme="majorHAnsi" w:cstheme="majorHAnsi"/>
+              <w:color w:val="000000" w:themeColor="text1"/>
+              <w:lang w:val="el-GR"/>
+            </w:rPr>
+          </w:pPr>
+        </w:p>
+        <w:p>
+          <w:pPr>
+            <w:tabs>
+              <w:tab w:val="left" w:pos="1308"/>
+            </w:tabs>
+            <w:spacing w:after="200" w:line="276" w:lineRule="auto"/>
+            <w:ind w:firstLine="0"/>
+            <w:jc w:val="center"/>
+            <w:rPr>
+              <w:rFonts w:asciiTheme="majorHAnsi" w:hAnsiTheme="majorHAnsi" w:cstheme="majorHAnsi"/>
+              <w:color w:val="000000" w:themeColor="text1"/>
+              <w:lang w:val="el-GR"/>
+            </w:rPr>
+          </w:pPr>
+        </w:p>
+        <w:p>
+          <w:pPr>
+            <w:pStyle w:val="NoSpacing"/>
+            <w:rPr>
+              <w:rFonts w:asciiTheme="majorHAnsi" w:hAnsiTheme="majorHAnsi" w:cstheme="majorHAnsi"/>
+              <w:lang w:val="el-GR"/>
+            </w:rPr>
+          </w:pPr>
+          <w:r>
+            <w:rPr>
+              <w:rFonts w:asciiTheme="majorHAnsi" w:hAnsiTheme="majorHAnsi" w:cstheme="majorHAnsi"/>
+              <w:lang w:val="el-GR"/>
+            </w:rPr>
+            <w:tab/>
+          </w:r>
+        </w:p>
+        <w:p>
+          <w:pPr>
+            <w:pStyle w:val="NoSpacing"/>
+            <w:jc w:val="center"/>
+            <w:rPr>
+              <w:rFonts w:asciiTheme="majorHAnsi" w:hAnsiTheme="majorHAnsi" w:cstheme="majorHAnsi"/>
+              <w:b/>
+              <w:bCs/>
+              <w:sz w:val="24"/>
+              <w:szCs w:val="24"/>
+              <w:lang w:val="el-GR"/>
+            </w:rPr>
+          </w:pPr>
+          <w:r>
+            <w:rPr>
+              <w:rFonts w:asciiTheme="majorHAnsi" w:hAnsiTheme="majorHAnsi" w:cstheme="majorHAnsi"/>
+              <w:b/>
+              <w:bCs/>
+              <w:sz w:val="24"/>
+              <w:szCs w:val="24"/>
+              <w:lang w:val="el-GR"/>
+            </w:rPr>
+            <w:t>«Εφαρμογές Μηχανικής Μάθησης σε Μεταβολωμικά Δεδομένα»</w:t>
+          </w:r>
+        </w:p>
+        <w:p>
+          <w:pPr>
+            <w:pStyle w:val="NoSpacing"/>
+            <w:rPr>
+              <w:rFonts w:asciiTheme="majorHAnsi" w:hAnsiTheme="majorHAnsi" w:cstheme="majorHAnsi"/>
+              <w:lang w:val="el-GR"/>
+            </w:rPr>
+          </w:pPr>
+        </w:p>
+        <w:p>
+          <w:pPr>
+            <w:pStyle w:val="NoSpacing"/>
+            <w:rPr>
+              <w:rFonts w:asciiTheme="majorHAnsi" w:hAnsiTheme="majorHAnsi" w:cstheme="majorHAnsi"/>
+              <w:lang w:val="el-GR"/>
+            </w:rPr>
+          </w:pPr>
+        </w:p>
+        <w:p>
+          <w:pPr>
+            <w:pStyle w:val="NoSpacing"/>
+            <w:rPr>
+              <w:rFonts w:asciiTheme="majorHAnsi" w:hAnsiTheme="majorHAnsi" w:cstheme="majorHAnsi"/>
+              <w:lang w:val="el-GR"/>
+            </w:rPr>
+          </w:pPr>
+        </w:p>
+        <w:p>
+          <w:pPr>
+            <w:pStyle w:val="NoSpacing"/>
+            <w:rPr>
+              <w:rFonts w:asciiTheme="majorHAnsi" w:hAnsiTheme="majorHAnsi" w:cstheme="majorHAnsi"/>
+              <w:lang w:val="el-GR"/>
+            </w:rPr>
+          </w:pPr>
+        </w:p>
+        <w:p>
+          <w:pPr>
+            <w:pStyle w:val="NoSpacing"/>
+            <w:rPr>
+              <w:rFonts w:asciiTheme="majorHAnsi" w:hAnsiTheme="majorHAnsi" w:cstheme="majorHAnsi"/>
+              <w:lang w:val="el-GR"/>
+            </w:rPr>
+          </w:pPr>
+        </w:p>
+        <w:p>
+          <w:pPr>
+            <w:pStyle w:val="NoSpacing"/>
+            <w:rPr>
+              <w:rFonts w:asciiTheme="majorHAnsi" w:hAnsiTheme="majorHAnsi" w:cstheme="majorHAnsi"/>
+              <w:lang w:val="el-GR"/>
+            </w:rPr>
+          </w:pPr>
+        </w:p>
+        <w:p>
+          <w:pPr>
+            <w:pStyle w:val="NoSpacing"/>
+            <w:jc w:val="center"/>
+            <w:rPr>
+              <w:rFonts w:asciiTheme="majorHAnsi" w:hAnsiTheme="majorHAnsi" w:cstheme="majorHAnsi"/>
+              <w:color w:val="000000" w:themeColor="text1"/>
+              <w:sz w:val="24"/>
+              <w:lang w:val="el-GR"/>
+            </w:rPr>
+          </w:pPr>
+          <w:r>
+            <w:rPr>
+              <w:rFonts w:asciiTheme="majorHAnsi" w:hAnsiTheme="majorHAnsi" w:cstheme="majorHAnsi"/>
+              <w:color w:val="000000" w:themeColor="text1"/>
+              <w:sz w:val="24"/>
+              <w:lang w:val="el-GR"/>
+            </w:rPr>
+            <w:t>Διπλωματική εργασία για την εκπλήρωση των απαιτήσεων του Μεταπτυχιακού Προγράμματος Σπουδών</w:t>
+          </w:r>
+        </w:p>
+        <w:p>
+          <w:pPr>
+            <w:pStyle w:val="NoSpacing"/>
+            <w:jc w:val="center"/>
+            <w:rPr>
+              <w:rFonts w:asciiTheme="majorHAnsi" w:hAnsiTheme="majorHAnsi" w:cstheme="majorHAnsi"/>
+              <w:b/>
+              <w:bCs/>
+              <w:color w:val="000000" w:themeColor="text1"/>
+              <w:sz w:val="24"/>
+              <w:lang w:val="el-GR"/>
+            </w:rPr>
+          </w:pPr>
+          <w:r>
+            <w:rPr>
+              <w:rFonts w:asciiTheme="majorHAnsi" w:hAnsiTheme="majorHAnsi" w:cstheme="majorHAnsi"/>
+              <w:b/>
+              <w:bCs/>
+              <w:color w:val="000000" w:themeColor="text1"/>
+              <w:sz w:val="24"/>
+              <w:lang w:val="el-GR"/>
+            </w:rPr>
+            <w:t>«Εφαρμοσμένη Βιοπληροφορική – Ανάλυση Βιολογικών Δεδομένων»</w:t>
+          </w:r>
+        </w:p>
+        <w:p>
+          <w:pPr>
+            <w:pStyle w:val="NoSpacing"/>
+            <w:jc w:val="center"/>
+            <w:rPr>
+              <w:rFonts w:asciiTheme="majorHAnsi" w:hAnsiTheme="majorHAnsi" w:cstheme="majorHAnsi"/>
+              <w:b/>
+              <w:bCs/>
+              <w:color w:val="000000" w:themeColor="text1"/>
+              <w:sz w:val="24"/>
+              <w:lang w:val="el-GR"/>
+            </w:rPr>
+          </w:pPr>
+        </w:p>
+        <w:p>
+          <w:pPr>
+            <w:pStyle w:val="NoSpacing"/>
+            <w:jc w:val="center"/>
+            <w:rPr>
+              <w:rFonts w:asciiTheme="majorHAnsi" w:hAnsiTheme="majorHAnsi" w:cstheme="majorHAnsi"/>
+              <w:b/>
+              <w:bCs/>
+              <w:color w:val="000000" w:themeColor="text1"/>
+              <w:sz w:val="24"/>
+              <w:lang w:val="el-GR"/>
+            </w:rPr>
+          </w:pPr>
+        </w:p>
+        <w:p>
+          <w:pPr>
+            <w:pStyle w:val="NoSpacing"/>
+            <w:jc w:val="center"/>
+            <w:rPr>
+              <w:rFonts w:asciiTheme="majorHAnsi" w:hAnsiTheme="majorHAnsi" w:cstheme="majorHAnsi"/>
+              <w:b/>
+              <w:bCs/>
+              <w:color w:val="000000" w:themeColor="text1"/>
+              <w:sz w:val="24"/>
+              <w:lang w:val="el-GR"/>
+            </w:rPr>
+          </w:pPr>
+        </w:p>
+        <w:p>
+          <w:pPr>
+            <w:pStyle w:val="NoSpacing"/>
+            <w:jc w:val="center"/>
+            <w:rPr>
+              <w:rFonts w:asciiTheme="majorHAnsi" w:hAnsiTheme="majorHAnsi" w:cstheme="majorHAnsi"/>
+              <w:b/>
+              <w:bCs/>
+              <w:color w:val="000000" w:themeColor="text1"/>
+              <w:sz w:val="24"/>
+              <w:lang w:val="el-GR"/>
+            </w:rPr>
+          </w:pPr>
+        </w:p>
+        <w:p>
+          <w:pPr>
+            <w:pStyle w:val="NoSpacing"/>
+            <w:jc w:val="center"/>
+            <w:rPr>
+              <w:rFonts w:asciiTheme="majorHAnsi" w:hAnsiTheme="majorHAnsi" w:cstheme="majorHAnsi"/>
+              <w:b/>
+              <w:bCs/>
+              <w:color w:val="000000" w:themeColor="text1"/>
+              <w:sz w:val="24"/>
+              <w:lang w:val="el-GR"/>
+            </w:rPr>
+          </w:pPr>
+        </w:p>
+        <w:p>
+          <w:pPr>
+            <w:pStyle w:val="NoSpacing"/>
+            <w:jc w:val="center"/>
+            <w:rPr>
+              <w:rFonts w:asciiTheme="majorHAnsi" w:hAnsiTheme="majorHAnsi" w:cstheme="majorHAnsi"/>
+              <w:color w:val="000000" w:themeColor="text1"/>
+              <w:sz w:val="24"/>
+              <w:lang w:val="el-GR"/>
+            </w:rPr>
+          </w:pPr>
+          <w:r>
+            <w:rPr>
+              <w:rFonts w:asciiTheme="majorHAnsi" w:hAnsiTheme="majorHAnsi" w:cstheme="majorHAnsi"/>
+              <w:color w:val="000000" w:themeColor="text1"/>
+              <w:sz w:val="24"/>
+              <w:lang w:val="el-GR"/>
+            </w:rPr>
+            <w:t>Της</w:t>
+          </w:r>
+        </w:p>
+        <w:p>
+          <w:pPr>
+            <w:pStyle w:val="NoSpacing"/>
+            <w:jc w:val="center"/>
+            <w:rPr>
+              <w:rFonts w:asciiTheme="majorHAnsi" w:hAnsiTheme="majorHAnsi" w:cstheme="majorHAnsi"/>
+              <w:color w:val="000000" w:themeColor="text1"/>
+              <w:sz w:val="24"/>
+              <w:lang w:val="el-GR"/>
+            </w:rPr>
+          </w:pPr>
+          <w:r>
+            <w:rPr>
+              <w:rFonts w:asciiTheme="majorHAnsi" w:hAnsiTheme="majorHAnsi" w:cstheme="majorHAnsi"/>
+              <w:color w:val="000000" w:themeColor="text1"/>
+              <w:sz w:val="24"/>
+              <w:lang w:val="el-GR"/>
+            </w:rPr>
+            <w:t>Ζηππίδου Κυριακής, ΑΕΜ: 661</w:t>
+          </w:r>
+        </w:p>
+        <w:p>
+          <w:pPr>
+            <w:pStyle w:val="NoSpacing"/>
+            <w:jc w:val="center"/>
+            <w:rPr>
+              <w:rFonts w:asciiTheme="majorHAnsi" w:hAnsiTheme="majorHAnsi" w:cstheme="majorHAnsi"/>
+              <w:b/>
+              <w:bCs/>
+              <w:color w:val="000000" w:themeColor="text1"/>
+              <w:sz w:val="24"/>
+              <w:lang w:val="el-GR"/>
+            </w:rPr>
+          </w:pPr>
+        </w:p>
+        <w:p>
+          <w:pPr>
+            <w:pStyle w:val="NoSpacing"/>
+            <w:jc w:val="center"/>
+            <w:rPr>
+              <w:rFonts w:asciiTheme="majorHAnsi" w:hAnsiTheme="majorHAnsi" w:cstheme="majorHAnsi"/>
+              <w:b/>
+              <w:bCs/>
+              <w:color w:val="000000" w:themeColor="text1"/>
+              <w:sz w:val="24"/>
+              <w:lang w:val="el-GR"/>
+            </w:rPr>
+          </w:pPr>
+        </w:p>
+        <w:p>
+          <w:pPr>
+            <w:pStyle w:val="NoSpacing"/>
+            <w:jc w:val="center"/>
+            <w:rPr>
+              <w:rFonts w:asciiTheme="majorHAnsi" w:hAnsiTheme="majorHAnsi" w:cstheme="majorHAnsi"/>
+              <w:b/>
+              <w:bCs/>
+              <w:color w:val="000000" w:themeColor="text1"/>
+              <w:sz w:val="24"/>
+              <w:lang w:val="el-GR"/>
+            </w:rPr>
+          </w:pPr>
+        </w:p>
+        <w:p>
+          <w:pPr>
+            <w:pStyle w:val="NoSpacing"/>
+            <w:jc w:val="center"/>
+            <w:rPr>
+              <w:rFonts w:asciiTheme="majorHAnsi" w:hAnsiTheme="majorHAnsi" w:cstheme="majorHAnsi"/>
+              <w:b/>
+              <w:bCs/>
+              <w:color w:val="000000" w:themeColor="text1"/>
+              <w:sz w:val="24"/>
+              <w:lang w:val="el-GR"/>
+            </w:rPr>
+          </w:pPr>
+        </w:p>
+        <w:p>
+          <w:pPr>
+            <w:pStyle w:val="NoSpacing"/>
+            <w:jc w:val="center"/>
+            <w:rPr>
+              <w:rFonts w:asciiTheme="majorHAnsi" w:hAnsiTheme="majorHAnsi" w:cstheme="majorHAnsi"/>
+              <w:b/>
+              <w:bCs/>
+              <w:color w:val="000000" w:themeColor="text1"/>
+              <w:sz w:val="24"/>
+              <w:lang w:val="el-GR"/>
+            </w:rPr>
+          </w:pPr>
+        </w:p>
+        <w:p>
+          <w:pPr>
+            <w:pStyle w:val="NoSpacing"/>
+            <w:jc w:val="center"/>
+            <w:rPr>
+              <w:rFonts w:asciiTheme="majorHAnsi" w:hAnsiTheme="majorHAnsi" w:cstheme="majorHAnsi"/>
+              <w:color w:val="000000" w:themeColor="text1"/>
+              <w:sz w:val="24"/>
+              <w:lang w:val="el-GR"/>
+            </w:rPr>
+          </w:pPr>
+          <w:r>
+            <w:rPr>
+              <w:rFonts w:asciiTheme="majorHAnsi" w:hAnsiTheme="majorHAnsi" w:cstheme="majorHAnsi"/>
+              <w:color w:val="000000" w:themeColor="text1"/>
+              <w:sz w:val="24"/>
+              <w:lang w:val="el-GR"/>
+            </w:rPr>
+            <w:t xml:space="preserve">Επιβλέπων καθηγητής: </w:t>
+          </w:r>
+          <w:r>
+            <w:rPr>
+              <w:rFonts w:asciiTheme="majorHAnsi" w:hAnsiTheme="majorHAnsi" w:cstheme="majorHAnsi"/>
+              <w:color w:val="000000" w:themeColor="text1"/>
+              <w:sz w:val="24"/>
+              <w:lang w:val="el-GR"/>
+            </w:rPr>
+            <w:t>Ψωμόπουλος Φώτης, Ερευνητής Γ, ΕΚΕΤΑ</w:t>
+          </w:r>
+        </w:p>
+        <w:p>
+          <w:pPr>
+            <w:pStyle w:val="NoSpacing"/>
+            <w:jc w:val="center"/>
+            <w:rPr>
+              <w:rFonts w:asciiTheme="majorHAnsi" w:hAnsiTheme="majorHAnsi" w:cstheme="majorHAnsi"/>
+              <w:b/>
+              <w:bCs/>
+              <w:color w:val="000000" w:themeColor="text1"/>
+              <w:sz w:val="24"/>
+              <w:lang w:val="el-GR"/>
+            </w:rPr>
+          </w:pPr>
+        </w:p>
+        <w:p>
+          <w:pPr>
+            <w:pStyle w:val="NoSpacing"/>
+            <w:jc w:val="center"/>
+            <w:rPr>
+              <w:rFonts w:asciiTheme="majorHAnsi" w:hAnsiTheme="majorHAnsi" w:cstheme="majorHAnsi"/>
+              <w:b/>
+              <w:bCs/>
+              <w:color w:val="000000" w:themeColor="text1"/>
+              <w:sz w:val="24"/>
+              <w:lang w:val="el-GR"/>
+            </w:rPr>
+          </w:pPr>
+        </w:p>
+        <w:p>
+          <w:pPr>
+            <w:pStyle w:val="NoSpacing"/>
+            <w:jc w:val="center"/>
+            <w:rPr>
+              <w:rFonts w:asciiTheme="majorHAnsi" w:hAnsiTheme="majorHAnsi" w:cstheme="majorHAnsi"/>
+              <w:b/>
+              <w:bCs/>
+              <w:color w:val="000000" w:themeColor="text1"/>
+              <w:sz w:val="24"/>
+              <w:lang w:val="el-GR"/>
+            </w:rPr>
+          </w:pPr>
+        </w:p>
+        <w:p>
+          <w:pPr>
+            <w:pStyle w:val="NoSpacing"/>
+            <w:jc w:val="center"/>
+            <w:rPr>
+              <w:rFonts w:asciiTheme="majorHAnsi" w:hAnsiTheme="majorHAnsi" w:cstheme="majorHAnsi"/>
+              <w:color w:val="000000" w:themeColor="text1"/>
+              <w:sz w:val="24"/>
+              <w:lang w:val="el-GR"/>
+            </w:rPr>
+          </w:pPr>
+          <w:r>
+            <w:rPr>
+              <w:rFonts w:asciiTheme="majorHAnsi" w:hAnsiTheme="majorHAnsi" w:cstheme="majorHAnsi"/>
+              <w:color w:val="000000" w:themeColor="text1"/>
+              <w:sz w:val="24"/>
+              <w:lang w:val="el-GR"/>
+            </w:rPr>
+            <w:t>Θεσσαλονίκη, Σεπτέμβριος, 2026</w:t>
+          </w:r>
+        </w:p>
+        <w:p>
+          <w:pPr>
+            <w:jc w:val="center"/>
+            <w:rPr>
+              <w:rFonts w:asciiTheme="majorHAnsi" w:hAnsiTheme="majorHAnsi" w:cstheme="majorHAnsi"/>
+              <w:lang w:val="el-GR"/>
+            </w:rPr>
+          </w:pPr>
+          <w:r>
+            <w:rPr>
+              <w:rFonts w:asciiTheme="majorHAnsi" w:hAnsiTheme="majorHAnsi" w:cstheme="majorHAnsi"/>
+              <w:noProof/>
+              <w:lang w:val="el-GR"/>
+            </w:rPr>
+            <w:lastRenderedPageBreak/>
+            <w:drawing>
+              <wp:inline distT="0" distB="0" distL="0" distR="0" wp14:anchorId="3F7BD9A6" wp14:editId="0D59949E">
+                <wp:extent cx="1645920" cy="1429092"/>
+                <wp:effectExtent l="0" t="0" r="0" b="0"/>
+                <wp:docPr id="1928718822" name="Picture 4"/>
+                <wp:cNvGraphicFramePr>
+                  <a:graphicFrameLocks xmlns:a="http://schemas.openxmlformats.org/drawingml/2006/main" noChangeAspect="1"/>
+                </wp:cNvGraphicFramePr>
+                <a:graphic xmlns:a="http://schemas.openxmlformats.org/drawingml/2006/main">
+                  <a:graphicData uri="http://schemas.openxmlformats.org/drawingml/2006/picture">
+                    <pic:pic xmlns:pic="http://schemas.openxmlformats.org/drawingml/2006/picture">
+                      <pic:nvPicPr>
+                        <pic:cNvPr id="0" name="Picture 3"/>
+                        <pic:cNvPicPr>
+                          <a:picLocks noChangeAspect="1" noChangeArrowheads="1"/>
+                        </pic:cNvPicPr>
+                      </pic:nvPicPr>
+                      <pic:blipFill rotWithShape="1">
+                        <a:blip r:embed="rId8">
+                          <a:extLst>
+                            <a:ext uri="{28A0092B-C50C-407E-A947-70E740481C1C}">
+                              <a14:useLocalDpi xmlns:a14="http://schemas.microsoft.com/office/drawing/2010/main" val="0"/>
+                            </a:ext>
+                          </a:extLst>
+                        </a:blip>
+                        <a:srcRect l="12698" t="8478" r="16614" b="9573"/>
+                        <a:stretch>
+                          <a:fillRect/>
+                        </a:stretch>
+                      </pic:blipFill>
+                      <pic:spPr bwMode="auto">
+                        <a:xfrm>
+                          <a:off x="0" y="0"/>
+                          <a:ext cx="1664675" cy="1445376"/>
+                        </a:xfrm>
+                        <a:prstGeom prst="rect">
+                          <a:avLst/>
+                        </a:prstGeom>
+                        <a:noFill/>
+                        <a:ln>
+                          <a:noFill/>
+                        </a:ln>
+                        <a:extLst>
+                          <a:ext uri="{53640926-AAD7-44D8-BBD7-CCE9431645EC}">
+                            <a14:shadowObscured xmlns:a14="http://schemas.microsoft.com/office/drawing/2010/main"/>
+                          </a:ext>
+                        </a:extLst>
+                      </pic:spPr>
+                    </pic:pic>
+                  </a:graphicData>
+                </a:graphic>
+              </wp:inline>
+            </w:drawing>
+          </w:r>
+          <w:r>
+            <w:rPr>
+              <w:rFonts w:asciiTheme="majorHAnsi" w:hAnsiTheme="majorHAnsi" w:cstheme="majorHAnsi"/>
+              <w:lang w:val="el-GR"/>
+            </w:rPr>
+            <w:t xml:space="preserve"> </w:t>
+          </w:r>
+          <w:r>
+            <w:rPr>
+              <w:rFonts w:asciiTheme="majorHAnsi" w:hAnsiTheme="majorHAnsi" w:cstheme="majorHAnsi"/>
+              <w:noProof/>
+            </w:rPr>
+            <w:drawing>
+              <wp:inline distT="0" distB="0" distL="0" distR="0" wp14:anchorId="40A726AC" wp14:editId="678373F1">
+                <wp:extent cx="1722120" cy="1470660"/>
+                <wp:effectExtent l="0" t="0" r="0" b="0"/>
+                <wp:docPr id="1057790862" name="Picture 5" descr="Τμήμα Μοριακής Βιολογίας &amp; Γενετικής"/>
+                <wp:cNvGraphicFramePr>
+                  <a:graphicFrameLocks xmlns:a="http://schemas.openxmlformats.org/drawingml/2006/main" noChangeAspect="1"/>
+                </wp:cNvGraphicFramePr>
+                <a:graphic xmlns:a="http://schemas.openxmlformats.org/drawingml/2006/main">
+                  <a:graphicData uri="http://schemas.openxmlformats.org/drawingml/2006/picture">
+                    <pic:pic xmlns:pic="http://schemas.openxmlformats.org/drawingml/2006/picture">
+                      <pic:nvPicPr>
+                        <pic:cNvPr id="0" name="Picture 13" descr="Τμήμα Μοριακής Βιολογίας &amp; Γενετικής"/>
+                        <pic:cNvPicPr>
+                          <a:picLocks noChangeAspect="1" noChangeArrowheads="1"/>
+                        </pic:cNvPicPr>
+                      </pic:nvPicPr>
+                      <pic:blipFill>
+                        <a:blip r:embed="rId9">
+                          <a:extLst>
+                            <a:ext uri="{28A0092B-C50C-407E-A947-70E740481C1C}">
+                              <a14:useLocalDpi xmlns:a14="http://schemas.microsoft.com/office/drawing/2010/main" val="0"/>
+                            </a:ext>
+                          </a:extLst>
+                        </a:blip>
+                        <a:srcRect/>
+                        <a:stretch>
+                          <a:fillRect/>
+                        </a:stretch>
+                      </pic:blipFill>
+                      <pic:spPr bwMode="auto">
+                        <a:xfrm>
+                          <a:off x="0" y="0"/>
+                          <a:ext cx="1722120" cy="1470660"/>
+                        </a:xfrm>
+                        <a:prstGeom prst="rect">
+                          <a:avLst/>
+                        </a:prstGeom>
+                        <a:noFill/>
+                        <a:ln>
+                          <a:noFill/>
+                        </a:ln>
+                      </pic:spPr>
+                    </pic:pic>
+                  </a:graphicData>
+                </a:graphic>
+              </wp:inline>
+            </w:drawing>
+          </w:r>
+        </w:p>
+        <w:p>
+          <w:pPr>
+            <w:tabs>
+              <w:tab w:val="left" w:pos="1308"/>
+            </w:tabs>
+            <w:spacing w:after="200" w:line="276" w:lineRule="auto"/>
+            <w:ind w:firstLine="0"/>
+            <w:jc w:val="center"/>
+            <w:rPr>
+              <w:rFonts w:asciiTheme="majorHAnsi" w:hAnsiTheme="majorHAnsi" w:cstheme="majorHAnsi"/>
+              <w:color w:val="000000" w:themeColor="text1"/>
+              <w:szCs w:val="24"/>
+              <w:lang w:val="el-GR"/>
+            </w:rPr>
+          </w:pPr>
+          <w:r>
+            <w:rPr>
+              <w:rFonts w:asciiTheme="majorHAnsi" w:hAnsiTheme="majorHAnsi" w:cstheme="majorHAnsi"/>
+              <w:color w:val="000000" w:themeColor="text1"/>
+              <w:szCs w:val="24"/>
+              <w:lang w:val="el-GR"/>
+            </w:rPr>
+            <w:t>ΔΗΜΟΚΡΙΤΕΙΟ ΠΑΝΕΠΙΣΤΗΜΙΟ ΘΡΑΚΗΣ</w:t>
+          </w:r>
+        </w:p>
+        <w:p>
+          <w:pPr>
+            <w:tabs>
+              <w:tab w:val="left" w:pos="1308"/>
+            </w:tabs>
+            <w:spacing w:after="200" w:line="276" w:lineRule="auto"/>
+            <w:ind w:firstLine="0"/>
+            <w:jc w:val="center"/>
+            <w:rPr>
+              <w:rFonts w:asciiTheme="majorHAnsi" w:hAnsiTheme="majorHAnsi" w:cstheme="majorHAnsi"/>
+              <w:color w:val="000000" w:themeColor="text1"/>
+              <w:szCs w:val="24"/>
+              <w:lang w:val="el-GR"/>
+            </w:rPr>
+          </w:pPr>
+          <w:r>
+            <w:rPr>
+              <w:rFonts w:asciiTheme="majorHAnsi" w:hAnsiTheme="majorHAnsi" w:cstheme="majorHAnsi"/>
+              <w:color w:val="000000" w:themeColor="text1"/>
+              <w:szCs w:val="24"/>
+              <w:lang w:val="el-GR"/>
+            </w:rPr>
+            <w:t>ΣΧΟΛΗ ΕΠΙΣΤΗΜΩΝ ΥΓΕΙΑΣ</w:t>
+          </w:r>
+        </w:p>
+        <w:p>
+          <w:pPr>
+            <w:tabs>
+              <w:tab w:val="left" w:pos="1308"/>
+            </w:tabs>
+            <w:spacing w:after="200" w:line="276" w:lineRule="auto"/>
+            <w:ind w:firstLine="0"/>
+            <w:jc w:val="center"/>
+            <w:rPr>
+              <w:rFonts w:asciiTheme="majorHAnsi" w:hAnsiTheme="majorHAnsi" w:cstheme="majorHAnsi"/>
+              <w:color w:val="000000" w:themeColor="text1"/>
+              <w:szCs w:val="24"/>
+              <w:lang w:val="el-GR"/>
+            </w:rPr>
+          </w:pPr>
+          <w:r>
+            <w:rPr>
+              <w:rFonts w:asciiTheme="majorHAnsi" w:hAnsiTheme="majorHAnsi" w:cstheme="majorHAnsi"/>
+              <w:color w:val="000000" w:themeColor="text1"/>
+              <w:szCs w:val="24"/>
+              <w:lang w:val="el-GR"/>
+            </w:rPr>
+            <w:t>ΤΜΗΜΑ ΜΟΡΙΑΚΗΣ ΒΙΟΛΟΓΙΑΣ ΚΑΙ ΓΕΝΕΤΙΚΗΣ</w:t>
+          </w:r>
+        </w:p>
+        <w:p>
+          <w:pPr>
+            <w:tabs>
+              <w:tab w:val="left" w:pos="1308"/>
+            </w:tabs>
+            <w:spacing w:after="200" w:line="276" w:lineRule="auto"/>
+            <w:ind w:firstLine="0"/>
+            <w:jc w:val="center"/>
+            <w:rPr>
+              <w:rFonts w:asciiTheme="majorHAnsi" w:hAnsiTheme="majorHAnsi" w:cstheme="majorHAnsi"/>
+              <w:color w:val="000000" w:themeColor="text1"/>
+              <w:szCs w:val="24"/>
+              <w:lang w:val="el-GR"/>
+            </w:rPr>
+          </w:pPr>
+        </w:p>
+        <w:p>
+          <w:pPr>
+            <w:tabs>
+              <w:tab w:val="left" w:pos="1308"/>
+            </w:tabs>
+            <w:spacing w:after="200" w:line="276" w:lineRule="auto"/>
+            <w:ind w:firstLine="0"/>
+            <w:jc w:val="center"/>
+            <w:rPr>
+              <w:rFonts w:asciiTheme="majorHAnsi" w:hAnsiTheme="majorHAnsi" w:cstheme="majorHAnsi"/>
+              <w:color w:val="000000" w:themeColor="text1"/>
+              <w:szCs w:val="24"/>
+              <w:lang w:val="el-GR"/>
+            </w:rPr>
+          </w:pPr>
+        </w:p>
+        <w:p>
+          <w:pPr>
+            <w:tabs>
+              <w:tab w:val="left" w:pos="1308"/>
+            </w:tabs>
+            <w:spacing w:after="200" w:line="276" w:lineRule="auto"/>
+            <w:ind w:firstLine="0"/>
+            <w:jc w:val="center"/>
+            <w:rPr>
+              <w:rFonts w:asciiTheme="majorHAnsi" w:hAnsiTheme="majorHAnsi" w:cstheme="majorHAnsi"/>
+              <w:color w:val="000000" w:themeColor="text1"/>
+              <w:szCs w:val="24"/>
+              <w:lang w:val="el-GR"/>
+            </w:rPr>
+          </w:pPr>
+          <w:r>
+            <w:rPr>
+              <w:rFonts w:asciiTheme="majorHAnsi" w:hAnsiTheme="majorHAnsi" w:cstheme="majorHAnsi"/>
+              <w:color w:val="000000" w:themeColor="text1"/>
+              <w:szCs w:val="24"/>
+              <w:lang w:val="el-GR"/>
+            </w:rPr>
+            <w:t>Πρόγραμμα Μεπαπτυχιακών Σπουδών:</w:t>
+          </w:r>
+        </w:p>
+        <w:p>
+          <w:pPr>
+            <w:tabs>
+              <w:tab w:val="left" w:pos="1308"/>
+            </w:tabs>
+            <w:spacing w:after="200" w:line="276" w:lineRule="auto"/>
+            <w:ind w:firstLine="0"/>
+            <w:jc w:val="center"/>
+            <w:rPr>
+              <w:rFonts w:asciiTheme="majorHAnsi" w:hAnsiTheme="majorHAnsi" w:cstheme="majorHAnsi"/>
+              <w:color w:val="000000" w:themeColor="text1"/>
+              <w:szCs w:val="24"/>
+              <w:lang w:val="el-GR"/>
+            </w:rPr>
+          </w:pPr>
+          <w:r>
+            <w:rPr>
+              <w:rFonts w:asciiTheme="majorHAnsi" w:hAnsiTheme="majorHAnsi" w:cstheme="majorHAnsi"/>
+              <w:b/>
+              <w:bCs/>
+              <w:color w:val="000000" w:themeColor="text1"/>
+              <w:szCs w:val="24"/>
+              <w:lang w:val="el-GR"/>
+            </w:rPr>
+            <w:t>«Εφαρμοσμένη Βιοπληροφορική – Ανάλυση Βιολογικών Δεδομένων»</w:t>
+          </w:r>
+        </w:p>
+        <w:p>
+          <w:pPr>
+            <w:tabs>
+              <w:tab w:val="left" w:pos="1308"/>
+            </w:tabs>
+            <w:spacing w:after="200" w:line="276" w:lineRule="auto"/>
+            <w:ind w:firstLine="0"/>
+            <w:jc w:val="center"/>
+            <w:rPr>
+              <w:rFonts w:asciiTheme="majorHAnsi" w:hAnsiTheme="majorHAnsi" w:cstheme="majorHAnsi"/>
+              <w:color w:val="000000" w:themeColor="text1"/>
+              <w:szCs w:val="24"/>
+              <w:lang w:val="el-GR"/>
+            </w:rPr>
+          </w:pPr>
+        </w:p>
+        <w:p>
+          <w:pPr>
+            <w:pStyle w:val="NoSpacing"/>
+            <w:jc w:val="center"/>
+            <w:rPr>
+              <w:rFonts w:asciiTheme="majorHAnsi" w:hAnsiTheme="majorHAnsi" w:cstheme="majorHAnsi"/>
+              <w:sz w:val="24"/>
+              <w:szCs w:val="24"/>
+              <w:lang w:val="el-GR"/>
+            </w:rPr>
+          </w:pPr>
+          <w:r>
+            <w:rPr>
+              <w:rFonts w:asciiTheme="majorHAnsi" w:hAnsiTheme="majorHAnsi" w:cstheme="majorHAnsi"/>
+              <w:sz w:val="24"/>
+              <w:szCs w:val="24"/>
+              <w:lang w:val="el-GR"/>
+            </w:rPr>
+            <w:t>Μεταπτυχιακή Διπλωματική Εργασία:</w:t>
+          </w:r>
+        </w:p>
+        <w:p>
+          <w:pPr>
+            <w:pStyle w:val="NoSpacing"/>
+            <w:jc w:val="center"/>
+            <w:rPr>
+              <w:rFonts w:asciiTheme="majorHAnsi" w:hAnsiTheme="majorHAnsi" w:cstheme="majorHAnsi"/>
+              <w:sz w:val="24"/>
+              <w:szCs w:val="24"/>
+              <w:lang w:val="el-GR"/>
+            </w:rPr>
+          </w:pPr>
+        </w:p>
+        <w:p>
+          <w:pPr>
+            <w:pStyle w:val="NoSpacing"/>
+            <w:jc w:val="center"/>
+            <w:rPr>
+              <w:rFonts w:asciiTheme="majorHAnsi" w:hAnsiTheme="majorHAnsi" w:cstheme="majorHAnsi"/>
+              <w:b/>
+              <w:bCs/>
+              <w:sz w:val="24"/>
+              <w:szCs w:val="24"/>
+              <w:lang w:val="el-GR"/>
+            </w:rPr>
+          </w:pPr>
+          <w:r>
+            <w:rPr>
+              <w:rFonts w:asciiTheme="majorHAnsi" w:hAnsiTheme="majorHAnsi" w:cstheme="majorHAnsi"/>
+              <w:b/>
+              <w:bCs/>
+              <w:sz w:val="24"/>
+              <w:szCs w:val="24"/>
+              <w:lang w:val="el-GR"/>
+            </w:rPr>
+            <w:t>«Εφαρμογές Μηχανικής Μάθησης σε Μεταβολωμικά Δεδομένα»</w:t>
+          </w:r>
+        </w:p>
+        <w:p>
+          <w:pPr>
+            <w:pStyle w:val="NoSpacing"/>
+            <w:jc w:val="center"/>
+            <w:rPr>
+              <w:rFonts w:asciiTheme="majorHAnsi" w:hAnsiTheme="majorHAnsi" w:cstheme="majorHAnsi"/>
+              <w:sz w:val="24"/>
+              <w:szCs w:val="24"/>
+              <w:lang w:val="el-GR"/>
+            </w:rPr>
+          </w:pPr>
+        </w:p>
+        <w:p>
+          <w:pPr>
+            <w:pStyle w:val="NoSpacing"/>
+            <w:jc w:val="center"/>
+            <w:rPr>
+              <w:rFonts w:asciiTheme="majorHAnsi" w:hAnsiTheme="majorHAnsi" w:cstheme="majorHAnsi"/>
+              <w:color w:val="000000" w:themeColor="text1"/>
+              <w:sz w:val="24"/>
+              <w:szCs w:val="24"/>
+            </w:rPr>
+          </w:pPr>
+        </w:p>
+        <w:p>
+          <w:pPr>
+            <w:pStyle w:val="NoSpacing"/>
+            <w:jc w:val="center"/>
+            <w:rPr>
+              <w:rFonts w:asciiTheme="majorHAnsi" w:hAnsiTheme="majorHAnsi" w:cstheme="majorHAnsi"/>
+              <w:color w:val="000000" w:themeColor="text1"/>
+              <w:sz w:val="24"/>
+              <w:szCs w:val="24"/>
+              <w:lang w:val="el-GR"/>
+            </w:rPr>
+          </w:pPr>
+          <w:r>
+            <w:rPr>
+              <w:rFonts w:asciiTheme="majorHAnsi" w:hAnsiTheme="majorHAnsi" w:cstheme="majorHAnsi"/>
+              <w:color w:val="000000" w:themeColor="text1"/>
+              <w:sz w:val="24"/>
+              <w:szCs w:val="24"/>
+              <w:lang w:val="el-GR"/>
+            </w:rPr>
+            <w:t>Ζηππίδου Κυριακής, ΑΕΜ: 661</w:t>
+          </w:r>
+        </w:p>
+        <w:p>
+          <w:pPr>
+            <w:pStyle w:val="NoSpacing"/>
+            <w:jc w:val="center"/>
+            <w:rPr>
+              <w:rFonts w:asciiTheme="majorHAnsi" w:hAnsiTheme="majorHAnsi" w:cstheme="majorHAnsi"/>
+              <w:b/>
+              <w:bCs/>
+              <w:color w:val="000000" w:themeColor="text1"/>
+              <w:sz w:val="24"/>
+              <w:lang w:val="el-GR"/>
+            </w:rPr>
+          </w:pPr>
+        </w:p>
+        <w:p>
+          <w:pPr>
+            <w:pStyle w:val="NoSpacing"/>
+            <w:jc w:val="center"/>
+            <w:rPr>
+              <w:rFonts w:asciiTheme="majorHAnsi" w:hAnsiTheme="majorHAnsi" w:cstheme="majorHAnsi"/>
+              <w:b/>
+              <w:bCs/>
+              <w:color w:val="000000" w:themeColor="text1"/>
+              <w:sz w:val="24"/>
+              <w:lang w:val="el-GR"/>
+            </w:rPr>
+          </w:pPr>
+        </w:p>
+        <w:p>
+          <w:pPr>
+            <w:pStyle w:val="NoSpacing"/>
+            <w:jc w:val="center"/>
+            <w:rPr>
+              <w:rFonts w:asciiTheme="majorHAnsi" w:hAnsiTheme="majorHAnsi" w:cstheme="majorHAnsi"/>
+              <w:b/>
+              <w:bCs/>
+              <w:color w:val="000000" w:themeColor="text1"/>
+              <w:sz w:val="24"/>
+              <w:lang w:val="el-GR"/>
+            </w:rPr>
+          </w:pPr>
+        </w:p>
+        <w:p>
+          <w:pPr>
+            <w:pStyle w:val="NoSpacing"/>
+            <w:jc w:val="center"/>
+            <w:rPr>
+              <w:rFonts w:asciiTheme="majorHAnsi" w:hAnsiTheme="majorHAnsi" w:cstheme="majorHAnsi"/>
+              <w:color w:val="000000" w:themeColor="text1"/>
+              <w:szCs w:val="20"/>
+              <w:lang w:val="el-GR"/>
+            </w:rPr>
+          </w:pPr>
+          <w:r>
+            <w:rPr>
+              <w:rFonts w:asciiTheme="majorHAnsi" w:hAnsiTheme="majorHAnsi" w:cstheme="majorHAnsi"/>
+              <w:color w:val="000000" w:themeColor="text1"/>
+              <w:szCs w:val="20"/>
+              <w:lang w:val="el-GR"/>
+            </w:rPr>
+            <w:t>Η  παρούσα Μεταπτυχιακή Εργασία Ειδίκευσης υποβλήθηκε στο Τμήμα Μοριακής Βιολογίας και Γενετικής, του Δημοκρίτειου Πανεπιστημίου Θράκης, για την απόκτηση του τίτλου μεταπτυχιακών σπουδών ειδίκευσης στις Επιστήμες της Εφαρμοσμένης Βιοπληροφορικής και Ανάλυσης Βιολογικών δεδομένων</w:t>
+          </w:r>
+        </w:p>
+        <w:p>
+          <w:pPr>
+            <w:pStyle w:val="NoSpacing"/>
+            <w:jc w:val="center"/>
+            <w:rPr>
+              <w:rFonts w:asciiTheme="majorHAnsi" w:hAnsiTheme="majorHAnsi" w:cstheme="majorHAnsi"/>
+              <w:b/>
+              <w:bCs/>
+              <w:color w:val="000000" w:themeColor="text1"/>
+              <w:sz w:val="24"/>
+              <w:lang w:val="el-GR"/>
+            </w:rPr>
+          </w:pPr>
+        </w:p>
+        <w:p>
+          <w:pPr>
+            <w:pStyle w:val="NoSpacing"/>
+            <w:jc w:val="center"/>
+            <w:rPr>
+              <w:rFonts w:asciiTheme="majorHAnsi" w:hAnsiTheme="majorHAnsi" w:cstheme="majorHAnsi"/>
+              <w:b/>
+              <w:bCs/>
+              <w:color w:val="000000" w:themeColor="text1"/>
+              <w:sz w:val="24"/>
+            </w:rPr>
+          </w:pPr>
+        </w:p>
+        <w:p>
+          <w:pPr>
+            <w:pStyle w:val="NoSpacing"/>
+            <w:jc w:val="center"/>
+            <w:rPr>
+              <w:rFonts w:asciiTheme="majorHAnsi" w:hAnsiTheme="majorHAnsi" w:cstheme="majorHAnsi"/>
+              <w:b/>
+              <w:bCs/>
+              <w:color w:val="000000" w:themeColor="text1"/>
+              <w:sz w:val="24"/>
+            </w:rPr>
+          </w:pPr>
+        </w:p>
+        <w:p>
+          <w:pPr>
+            <w:pStyle w:val="NoSpacing"/>
+            <w:jc w:val="center"/>
+            <w:rPr>
+              <w:rFonts w:asciiTheme="majorHAnsi" w:hAnsiTheme="majorHAnsi" w:cstheme="majorHAnsi"/>
+              <w:color w:val="000000" w:themeColor="text1"/>
+              <w:sz w:val="24"/>
+              <w:lang w:val="el-GR"/>
+            </w:rPr>
+          </w:pPr>
+          <w:r>
+            <w:rPr>
+              <w:rFonts w:asciiTheme="majorHAnsi" w:hAnsiTheme="majorHAnsi" w:cstheme="majorHAnsi"/>
+              <w:color w:val="000000" w:themeColor="text1"/>
+              <w:sz w:val="24"/>
+              <w:lang w:val="el-GR"/>
+            </w:rPr>
+            <w:t>ΕΞΕΤΑΣΤΙΚΗ ΕΠΙΤΡΟΠΗ</w:t>
+          </w:r>
+        </w:p>
+        <w:p>
+          <w:pPr>
+            <w:pStyle w:val="NoSpacing"/>
+            <w:jc w:val="center"/>
+            <w:rPr>
+              <w:rFonts w:asciiTheme="majorHAnsi" w:hAnsiTheme="majorHAnsi" w:cstheme="majorHAnsi"/>
+              <w:color w:val="000000" w:themeColor="text1"/>
+              <w:sz w:val="24"/>
+              <w:lang w:val="el-GR"/>
+            </w:rPr>
+          </w:pPr>
+        </w:p>
+        <w:p>
+          <w:pPr>
+            <w:pStyle w:val="NoSpacing"/>
+            <w:jc w:val="center"/>
+            <w:rPr>
+              <w:rFonts w:asciiTheme="majorHAnsi" w:hAnsiTheme="majorHAnsi" w:cstheme="majorHAnsi"/>
+              <w:color w:val="000000" w:themeColor="text1"/>
+              <w:sz w:val="24"/>
+              <w:lang w:val="el-GR"/>
+            </w:rPr>
+          </w:pPr>
+          <w:r>
+            <w:rPr>
+              <w:rFonts w:asciiTheme="majorHAnsi" w:hAnsiTheme="majorHAnsi" w:cstheme="majorHAnsi"/>
+              <w:color w:val="000000" w:themeColor="text1"/>
+              <w:sz w:val="24"/>
+              <w:lang w:val="el-GR"/>
+            </w:rPr>
+            <w:t>Επιβλέπων καθηγητής: Ψωμόπουλος Φώτης, Ερευνητής Γ, ΕΚΕΤΑ</w:t>
+          </w:r>
+        </w:p>
+        <w:p>
+          <w:pPr>
+            <w:pStyle w:val="NoSpacing"/>
+            <w:rPr>
+              <w:rFonts w:asciiTheme="majorHAnsi" w:hAnsiTheme="majorHAnsi" w:cstheme="majorHAnsi"/>
+              <w:color w:val="000000" w:themeColor="text1"/>
+              <w:sz w:val="24"/>
+              <w:lang w:val="el-GR"/>
+            </w:rPr>
+          </w:pPr>
+          <w:r>
+            <w:rPr>
+              <w:rFonts w:asciiTheme="majorHAnsi" w:hAnsiTheme="majorHAnsi" w:cstheme="majorHAnsi"/>
+              <w:color w:val="000000" w:themeColor="text1"/>
+              <w:sz w:val="24"/>
+              <w:lang w:val="el-GR"/>
+            </w:rPr>
+            <w:tab/>
+            <w:t xml:space="preserve">       </w:t>
+          </w:r>
+          <w:r>
+            <w:rPr>
+              <w:rFonts w:asciiTheme="majorHAnsi" w:hAnsiTheme="majorHAnsi" w:cstheme="majorHAnsi"/>
+              <w:color w:val="000000" w:themeColor="text1"/>
+              <w:sz w:val="24"/>
+              <w:lang w:val="el-GR"/>
+            </w:rPr>
+            <w:t xml:space="preserve">     </w:t>
+          </w:r>
+          <w:r>
+            <w:rPr>
+              <w:rFonts w:asciiTheme="majorHAnsi" w:hAnsiTheme="majorHAnsi" w:cstheme="majorHAnsi"/>
+              <w:color w:val="000000" w:themeColor="text1"/>
+              <w:sz w:val="24"/>
+              <w:lang w:val="el-GR"/>
+            </w:rPr>
+            <w:t>2</w:t>
+          </w:r>
+          <w:r>
+            <w:rPr>
+              <w:rFonts w:asciiTheme="majorHAnsi" w:hAnsiTheme="majorHAnsi" w:cstheme="majorHAnsi"/>
+              <w:color w:val="000000" w:themeColor="text1"/>
+              <w:sz w:val="24"/>
+              <w:vertAlign w:val="superscript"/>
+              <w:lang w:val="el-GR"/>
+            </w:rPr>
+            <w:t>ο</w:t>
+          </w:r>
+          <w:r>
+            <w:rPr>
+              <w:rFonts w:asciiTheme="majorHAnsi" w:hAnsiTheme="majorHAnsi" w:cstheme="majorHAnsi"/>
+              <w:color w:val="000000" w:themeColor="text1"/>
+              <w:sz w:val="24"/>
+              <w:lang w:val="el-GR"/>
+            </w:rPr>
+            <w:t xml:space="preserve"> Μέλος: Κλάπα Μαρία, ΙΤΕ</w:t>
+          </w:r>
+        </w:p>
+        <w:p>
+          <w:pPr>
+            <w:pStyle w:val="NoSpacing"/>
+            <w:jc w:val="center"/>
+            <w:rPr>
+              <w:rFonts w:asciiTheme="majorHAnsi" w:hAnsiTheme="majorHAnsi" w:cstheme="majorHAnsi"/>
+              <w:b/>
+              <w:bCs/>
+              <w:color w:val="000000" w:themeColor="text1"/>
+              <w:sz w:val="24"/>
+              <w:lang w:val="el-GR"/>
+            </w:rPr>
+          </w:pPr>
+        </w:p>
+        <w:p>
+          <w:pPr>
+            <w:pStyle w:val="NoSpacing"/>
+            <w:jc w:val="center"/>
+            <w:rPr>
+              <w:rFonts w:asciiTheme="majorHAnsi" w:hAnsiTheme="majorHAnsi" w:cstheme="majorHAnsi"/>
+              <w:b/>
+              <w:bCs/>
+              <w:color w:val="000000" w:themeColor="text1"/>
+              <w:sz w:val="24"/>
+              <w:lang w:val="el-GR"/>
+            </w:rPr>
+          </w:pPr>
+        </w:p>
+        <w:p>
+          <w:pPr>
+            <w:pStyle w:val="NoSpacing"/>
+            <w:jc w:val="center"/>
+            <w:rPr>
+              <w:rFonts w:asciiTheme="majorHAnsi" w:hAnsiTheme="majorHAnsi" w:cstheme="majorHAnsi"/>
+              <w:b/>
+              <w:bCs/>
+              <w:color w:val="000000" w:themeColor="text1"/>
+              <w:sz w:val="24"/>
+              <w:lang w:val="el-GR"/>
+            </w:rPr>
+          </w:pPr>
+        </w:p>
+        <w:p>
+          <w:pPr>
+            <w:pStyle w:val="NoSpacing"/>
+            <w:jc w:val="center"/>
+            <w:rPr>
+              <w:rFonts w:asciiTheme="majorHAnsi" w:hAnsiTheme="majorHAnsi" w:cstheme="majorHAnsi"/>
+              <w:color w:val="000000" w:themeColor="text1"/>
+              <w:sz w:val="24"/>
+              <w:lang w:val="el-GR"/>
+            </w:rPr>
+          </w:pPr>
+          <w:r>
+            <w:rPr>
+              <w:rFonts w:asciiTheme="majorHAnsi" w:hAnsiTheme="majorHAnsi" w:cstheme="majorHAnsi"/>
+              <w:color w:val="000000" w:themeColor="text1"/>
+              <w:sz w:val="24"/>
+              <w:lang w:val="el-GR"/>
+            </w:rPr>
+            <w:t>Θεσσαλονίκη, Σεπτέμβριος, 2026</w:t>
+          </w:r>
+        </w:p>
+        <w:p>
+          <w:pPr>
+            <w:jc w:val="center"/>
+            <w:rPr>
+              <w:rFonts w:asciiTheme="majorHAnsi" w:hAnsiTheme="majorHAnsi" w:cstheme="majorHAnsi"/>
+              <w:lang w:val="el-GR"/>
+            </w:rPr>
+          </w:pPr>
+          <w:r>
+            <w:rPr>
+              <w:rFonts w:asciiTheme="majorHAnsi" w:hAnsiTheme="majorHAnsi" w:cstheme="majorHAnsi"/>
+              <w:noProof/>
+              <w:lang w:val="el-GR"/>
+            </w:rPr>
+            <w:lastRenderedPageBreak/>
+            <w:drawing>
+              <wp:inline distT="0" distB="0" distL="0" distR="0" wp14:anchorId="530B0943" wp14:editId="696F35FD">
+                <wp:extent cx="1645920" cy="1429092"/>
+                <wp:effectExtent l="0" t="0" r="0" b="0"/>
+                <wp:docPr id="756764356" name="Picture 4"/>
+                <wp:cNvGraphicFramePr>
+                  <a:graphicFrameLocks xmlns:a="http://schemas.openxmlformats.org/drawingml/2006/main" noChangeAspect="1"/>
+                </wp:cNvGraphicFramePr>
+                <a:graphic xmlns:a="http://schemas.openxmlformats.org/drawingml/2006/main">
+                  <a:graphicData uri="http://schemas.openxmlformats.org/drawingml/2006/picture">
+                    <pic:pic xmlns:pic="http://schemas.openxmlformats.org/drawingml/2006/picture">
+                      <pic:nvPicPr>
+                        <pic:cNvPr id="0" name="Picture 3"/>
+                        <pic:cNvPicPr>
+                          <a:picLocks noChangeAspect="1" noChangeArrowheads="1"/>
+                        </pic:cNvPicPr>
+                      </pic:nvPicPr>
+                      <pic:blipFill rotWithShape="1">
+                        <a:blip r:embed="rId8">
+                          <a:extLst>
+                            <a:ext uri="{28A0092B-C50C-407E-A947-70E740481C1C}">
+                              <a14:useLocalDpi xmlns:a14="http://schemas.microsoft.com/office/drawing/2010/main" val="0"/>
+                            </a:ext>
+                          </a:extLst>
+                        </a:blip>
+                        <a:srcRect l="12698" t="8478" r="16614" b="9573"/>
+                        <a:stretch>
+                          <a:fillRect/>
+                        </a:stretch>
+                      </pic:blipFill>
+                      <pic:spPr bwMode="auto">
+                        <a:xfrm>
+                          <a:off x="0" y="0"/>
+                          <a:ext cx="1664675" cy="1445376"/>
+                        </a:xfrm>
+                        <a:prstGeom prst="rect">
+                          <a:avLst/>
+                        </a:prstGeom>
+                        <a:noFill/>
+                        <a:ln>
+                          <a:noFill/>
+                        </a:ln>
+                        <a:extLst>
+                          <a:ext uri="{53640926-AAD7-44D8-BBD7-CCE9431645EC}">
+                            <a14:shadowObscured xmlns:a14="http://schemas.microsoft.com/office/drawing/2010/main"/>
+                          </a:ext>
+                        </a:extLst>
+                      </pic:spPr>
+                    </pic:pic>
+                  </a:graphicData>
+                </a:graphic>
+              </wp:inline>
+            </w:drawing>
+          </w:r>
+          <w:r>
+            <w:rPr>
+              <w:rFonts w:asciiTheme="majorHAnsi" w:hAnsiTheme="majorHAnsi" w:cstheme="majorHAnsi"/>
+              <w:lang w:val="el-GR"/>
+            </w:rPr>
+            <w:t xml:space="preserve"> </w:t>
+          </w:r>
+          <w:r>
+            <w:rPr>
+              <w:rFonts w:asciiTheme="majorHAnsi" w:hAnsiTheme="majorHAnsi" w:cstheme="majorHAnsi"/>
+              <w:noProof/>
+            </w:rPr>
+            <w:drawing>
+              <wp:inline distT="0" distB="0" distL="0" distR="0" wp14:anchorId="6A772544" wp14:editId="77DD934B">
+                <wp:extent cx="1722120" cy="1470660"/>
+                <wp:effectExtent l="0" t="0" r="0" b="0"/>
+                <wp:docPr id="1917667495" name="Picture 5" descr="Τμήμα Μοριακής Βιολογίας &amp; Γενετικής"/>
+                <wp:cNvGraphicFramePr>
+                  <a:graphicFrameLocks xmlns:a="http://schemas.openxmlformats.org/drawingml/2006/main" noChangeAspect="1"/>
+                </wp:cNvGraphicFramePr>
+                <a:graphic xmlns:a="http://schemas.openxmlformats.org/drawingml/2006/main">
+                  <a:graphicData uri="http://schemas.openxmlformats.org/drawingml/2006/picture">
+                    <pic:pic xmlns:pic="http://schemas.openxmlformats.org/drawingml/2006/picture">
+                      <pic:nvPicPr>
+                        <pic:cNvPr id="0" name="Picture 13" descr="Τμήμα Μοριακής Βιολογίας &amp; Γενετικής"/>
+                        <pic:cNvPicPr>
+                          <a:picLocks noChangeAspect="1" noChangeArrowheads="1"/>
+                        </pic:cNvPicPr>
+                      </pic:nvPicPr>
+                      <pic:blipFill>
+                        <a:blip r:embed="rId9">
+                          <a:extLst>
+                            <a:ext uri="{28A0092B-C50C-407E-A947-70E740481C1C}">
+                              <a14:useLocalDpi xmlns:a14="http://schemas.microsoft.com/office/drawing/2010/main" val="0"/>
+                            </a:ext>
+                          </a:extLst>
+                        </a:blip>
+                        <a:srcRect/>
+                        <a:stretch>
+                          <a:fillRect/>
+                        </a:stretch>
+                      </pic:blipFill>
+                      <pic:spPr bwMode="auto">
+                        <a:xfrm>
+                          <a:off x="0" y="0"/>
+                          <a:ext cx="1722120" cy="1470660"/>
+                        </a:xfrm>
+                        <a:prstGeom prst="rect">
+                          <a:avLst/>
+                        </a:prstGeom>
+                        <a:noFill/>
+                        <a:ln>
+                          <a:noFill/>
+                        </a:ln>
+                      </pic:spPr>
+                    </pic:pic>
+                  </a:graphicData>
+                </a:graphic>
+              </wp:inline>
+            </w:drawing>
+          </w:r>
+        </w:p>
+        <w:p>
+          <w:pPr>
+            <w:tabs>
+              <w:tab w:val="left" w:pos="1308"/>
+            </w:tabs>
+            <w:spacing w:after="200" w:line="276" w:lineRule="auto"/>
+            <w:ind w:firstLine="0"/>
+            <w:jc w:val="center"/>
+            <w:rPr>
+              <w:rFonts w:asciiTheme="majorHAnsi" w:hAnsiTheme="majorHAnsi" w:cstheme="majorHAnsi"/>
+              <w:color w:val="000000" w:themeColor="text1"/>
+              <w:szCs w:val="24"/>
+            </w:rPr>
+          </w:pPr>
+          <w:r>
+            <w:rPr>
+              <w:rFonts w:asciiTheme="majorHAnsi" w:hAnsiTheme="majorHAnsi" w:cstheme="majorHAnsi"/>
+              <w:color w:val="000000" w:themeColor="text1"/>
+              <w:szCs w:val="24"/>
+            </w:rPr>
+            <w:t>DEMOCRITUS UNIVERSITY OF THRACE</w:t>
+          </w:r>
+        </w:p>
+        <w:p>
+          <w:pPr>
+            <w:tabs>
+              <w:tab w:val="left" w:pos="1308"/>
+            </w:tabs>
+            <w:spacing w:after="200" w:line="276" w:lineRule="auto"/>
+            <w:ind w:firstLine="0"/>
+            <w:jc w:val="center"/>
+            <w:rPr>
+              <w:rFonts w:asciiTheme="majorHAnsi" w:hAnsiTheme="majorHAnsi" w:cstheme="majorHAnsi"/>
+              <w:color w:val="000000" w:themeColor="text1"/>
+              <w:szCs w:val="24"/>
+            </w:rPr>
+          </w:pPr>
+          <w:r>
+            <w:rPr>
+              <w:rFonts w:asciiTheme="majorHAnsi" w:hAnsiTheme="majorHAnsi" w:cstheme="majorHAnsi"/>
+              <w:color w:val="000000" w:themeColor="text1"/>
+              <w:szCs w:val="24"/>
+            </w:rPr>
+            <w:t>S</w:t>
+          </w:r>
+          <w:r>
+            <w:rPr>
+              <w:rFonts w:asciiTheme="majorHAnsi" w:hAnsiTheme="majorHAnsi" w:cstheme="majorHAnsi"/>
+              <w:color w:val="000000" w:themeColor="text1"/>
+              <w:szCs w:val="24"/>
+            </w:rPr>
+            <w:t>CHHOOL OF HEALTH SCIENCES</w:t>
+          </w:r>
+        </w:p>
+        <w:p>
+          <w:pPr>
+            <w:tabs>
+              <w:tab w:val="left" w:pos="1308"/>
+            </w:tabs>
+            <w:spacing w:after="200" w:line="276" w:lineRule="auto"/>
+            <w:ind w:firstLine="0"/>
+            <w:jc w:val="center"/>
+            <w:rPr>
+              <w:rFonts w:asciiTheme="majorHAnsi" w:hAnsiTheme="majorHAnsi" w:cstheme="majorHAnsi"/>
+              <w:color w:val="000000" w:themeColor="text1"/>
+              <w:szCs w:val="24"/>
+            </w:rPr>
+          </w:pPr>
+          <w:r>
+            <w:rPr>
+              <w:rFonts w:asciiTheme="majorHAnsi" w:hAnsiTheme="majorHAnsi" w:cstheme="majorHAnsi"/>
+              <w:color w:val="000000" w:themeColor="text1"/>
+              <w:szCs w:val="24"/>
+            </w:rPr>
+            <w:t>D</w:t>
+          </w:r>
+          <w:r>
+            <w:rPr>
+              <w:rFonts w:asciiTheme="majorHAnsi" w:hAnsiTheme="majorHAnsi" w:cstheme="majorHAnsi"/>
+              <w:color w:val="000000" w:themeColor="text1"/>
+              <w:szCs w:val="24"/>
+            </w:rPr>
+            <w:t>EPARTMENT OF MOLECULAR BIOLOGY AND GENETICS</w:t>
+          </w:r>
+        </w:p>
+        <w:p>
+          <w:pPr>
+            <w:tabs>
+              <w:tab w:val="left" w:pos="1308"/>
+            </w:tabs>
+            <w:spacing w:after="200" w:line="276" w:lineRule="auto"/>
+            <w:ind w:firstLine="0"/>
+            <w:jc w:val="center"/>
+            <w:rPr>
+              <w:rFonts w:asciiTheme="majorHAnsi" w:hAnsiTheme="majorHAnsi" w:cstheme="majorHAnsi"/>
+              <w:color w:val="000000" w:themeColor="text1"/>
+              <w:szCs w:val="24"/>
+            </w:rPr>
+          </w:pPr>
+        </w:p>
+        <w:p>
+          <w:pPr>
+            <w:tabs>
+              <w:tab w:val="left" w:pos="1308"/>
+            </w:tabs>
+            <w:spacing w:after="200" w:line="276" w:lineRule="auto"/>
+            <w:ind w:firstLine="0"/>
+            <w:jc w:val="center"/>
+            <w:rPr>
+              <w:rFonts w:asciiTheme="majorHAnsi" w:hAnsiTheme="majorHAnsi" w:cstheme="majorHAnsi"/>
+              <w:color w:val="000000" w:themeColor="text1"/>
+              <w:szCs w:val="24"/>
+            </w:rPr>
+          </w:pPr>
+        </w:p>
+        <w:p>
+          <w:pPr>
+            <w:tabs>
+              <w:tab w:val="left" w:pos="1308"/>
+            </w:tabs>
+            <w:spacing w:after="200" w:line="276" w:lineRule="auto"/>
+            <w:ind w:firstLine="0"/>
+            <w:jc w:val="center"/>
+            <w:rPr>
+              <w:rFonts w:asciiTheme="majorHAnsi" w:hAnsiTheme="majorHAnsi" w:cstheme="majorHAnsi"/>
+              <w:color w:val="000000" w:themeColor="text1"/>
+              <w:szCs w:val="24"/>
+            </w:rPr>
+          </w:pPr>
+          <w:r>
+            <w:rPr>
+              <w:rFonts w:asciiTheme="majorHAnsi" w:hAnsiTheme="majorHAnsi" w:cstheme="majorHAnsi"/>
+              <w:color w:val="000000" w:themeColor="text1"/>
+              <w:szCs w:val="24"/>
+            </w:rPr>
+            <w:t>Postgraduate Course</w:t>
+          </w:r>
+          <w:r>
+            <w:rPr>
+              <w:rFonts w:asciiTheme="majorHAnsi" w:hAnsiTheme="majorHAnsi" w:cstheme="majorHAnsi"/>
+              <w:color w:val="000000" w:themeColor="text1"/>
+              <w:szCs w:val="24"/>
+            </w:rPr>
+            <w:t>:</w:t>
+          </w:r>
+        </w:p>
+        <w:p>
+          <w:pPr>
+            <w:tabs>
+              <w:tab w:val="left" w:pos="1308"/>
+            </w:tabs>
+            <w:spacing w:after="200" w:line="276" w:lineRule="auto"/>
+            <w:ind w:firstLine="0"/>
+            <w:jc w:val="center"/>
+            <w:rPr>
+              <w:rFonts w:asciiTheme="majorHAnsi" w:hAnsiTheme="majorHAnsi" w:cstheme="majorHAnsi"/>
+              <w:b/>
+              <w:bCs/>
+              <w:color w:val="000000" w:themeColor="text1"/>
+              <w:szCs w:val="24"/>
+            </w:rPr>
+          </w:pPr>
+          <w:r>
+            <w:rPr>
+              <w:rFonts w:asciiTheme="majorHAnsi" w:hAnsiTheme="majorHAnsi" w:cstheme="majorHAnsi"/>
+              <w:b/>
+              <w:bCs/>
+              <w:color w:val="000000" w:themeColor="text1"/>
+              <w:szCs w:val="24"/>
+            </w:rPr>
+            <w:t>«</w:t>
+          </w:r>
+          <w:r>
+            <w:rPr>
+              <w:rFonts w:asciiTheme="majorHAnsi" w:hAnsiTheme="majorHAnsi" w:cstheme="majorHAnsi"/>
+            </w:rPr>
+            <w:t xml:space="preserve"> </w:t>
+          </w:r>
+          <w:r>
+            <w:rPr>
+              <w:rFonts w:asciiTheme="majorHAnsi" w:hAnsiTheme="majorHAnsi" w:cstheme="majorHAnsi"/>
+              <w:b/>
+              <w:bCs/>
+              <w:color w:val="000000" w:themeColor="text1"/>
+              <w:szCs w:val="24"/>
+            </w:rPr>
+            <w:t xml:space="preserve">Applied Bioinformatics </w:t>
+          </w:r>
+          <w:r>
+            <w:rPr>
+              <w:rFonts w:asciiTheme="majorHAnsi" w:hAnsiTheme="majorHAnsi" w:cstheme="majorHAnsi"/>
+              <w:b/>
+              <w:bCs/>
+              <w:color w:val="000000" w:themeColor="text1"/>
+              <w:szCs w:val="24"/>
+            </w:rPr>
+            <w:t>–</w:t>
+          </w:r>
+          <w:r>
+            <w:rPr>
+              <w:rFonts w:asciiTheme="majorHAnsi" w:hAnsiTheme="majorHAnsi" w:cstheme="majorHAnsi"/>
+              <w:b/>
+              <w:bCs/>
+              <w:color w:val="000000" w:themeColor="text1"/>
+              <w:szCs w:val="24"/>
+            </w:rPr>
+            <w:t xml:space="preserve"> </w:t>
+          </w:r>
+          <w:r>
+            <w:rPr>
+              <w:rFonts w:asciiTheme="majorHAnsi" w:hAnsiTheme="majorHAnsi" w:cstheme="majorHAnsi"/>
+              <w:b/>
+              <w:bCs/>
+              <w:color w:val="000000" w:themeColor="text1"/>
+              <w:szCs w:val="24"/>
+            </w:rPr>
+            <w:t xml:space="preserve">Biological </w:t>
+          </w:r>
+          <w:r>
+            <w:rPr>
+              <w:rFonts w:asciiTheme="majorHAnsi" w:hAnsiTheme="majorHAnsi" w:cstheme="majorHAnsi"/>
+              <w:b/>
+              <w:bCs/>
+              <w:color w:val="000000" w:themeColor="text1"/>
+              <w:szCs w:val="24"/>
+            </w:rPr>
+            <w:t>Data Analysis</w:t>
+          </w:r>
+          <w:r>
+            <w:rPr>
+              <w:rFonts w:asciiTheme="majorHAnsi" w:hAnsiTheme="majorHAnsi" w:cstheme="majorHAnsi"/>
+              <w:b/>
+              <w:bCs/>
+              <w:color w:val="000000" w:themeColor="text1"/>
+              <w:szCs w:val="24"/>
+            </w:rPr>
+            <w:t xml:space="preserve"> </w:t>
+          </w:r>
+          <w:r>
+            <w:rPr>
+              <w:rFonts w:asciiTheme="majorHAnsi" w:hAnsiTheme="majorHAnsi" w:cstheme="majorHAnsi"/>
+              <w:b/>
+              <w:bCs/>
+              <w:color w:val="000000" w:themeColor="text1"/>
+              <w:szCs w:val="24"/>
+            </w:rPr>
+            <w:t>»</w:t>
+          </w:r>
+        </w:p>
+        <w:p>
+          <w:pPr>
+            <w:tabs>
+              <w:tab w:val="left" w:pos="1308"/>
+            </w:tabs>
+            <w:spacing w:after="200" w:line="276" w:lineRule="auto"/>
+            <w:ind w:firstLine="0"/>
+            <w:jc w:val="center"/>
+            <w:rPr>
+              <w:rFonts w:asciiTheme="majorHAnsi" w:hAnsiTheme="majorHAnsi" w:cstheme="majorHAnsi"/>
+              <w:color w:val="000000" w:themeColor="text1"/>
+              <w:szCs w:val="24"/>
+            </w:rPr>
+          </w:pPr>
+        </w:p>
+        <w:p>
+          <w:pPr>
+            <w:pStyle w:val="NoSpacing"/>
+            <w:jc w:val="center"/>
+            <w:rPr>
+              <w:rFonts w:asciiTheme="majorHAnsi" w:hAnsiTheme="majorHAnsi" w:cstheme="majorHAnsi"/>
+              <w:sz w:val="24"/>
+              <w:szCs w:val="24"/>
+            </w:rPr>
+          </w:pPr>
+          <w:r>
+            <w:rPr>
+              <w:rFonts w:asciiTheme="majorHAnsi" w:hAnsiTheme="majorHAnsi" w:cstheme="majorHAnsi"/>
+              <w:sz w:val="24"/>
+              <w:szCs w:val="24"/>
+            </w:rPr>
+            <w:t>Master Dissertation</w:t>
+          </w:r>
+          <w:r>
+            <w:rPr>
+              <w:rFonts w:asciiTheme="majorHAnsi" w:hAnsiTheme="majorHAnsi" w:cstheme="majorHAnsi"/>
+              <w:sz w:val="24"/>
+              <w:szCs w:val="24"/>
+            </w:rPr>
+            <w:t>:</w:t>
+          </w:r>
+        </w:p>
+        <w:p>
+          <w:pPr>
+            <w:pStyle w:val="NoSpacing"/>
+            <w:jc w:val="center"/>
+            <w:rPr>
+              <w:rFonts w:asciiTheme="majorHAnsi" w:hAnsiTheme="majorHAnsi" w:cstheme="majorHAnsi"/>
+              <w:sz w:val="24"/>
+              <w:szCs w:val="24"/>
+            </w:rPr>
+          </w:pPr>
+        </w:p>
+        <w:p>
+          <w:pPr>
+            <w:pStyle w:val="NoSpacing"/>
+            <w:jc w:val="center"/>
+            <w:rPr>
+              <w:rFonts w:asciiTheme="majorHAnsi" w:hAnsiTheme="majorHAnsi" w:cstheme="majorHAnsi"/>
+              <w:b/>
+              <w:bCs/>
+              <w:sz w:val="24"/>
+              <w:szCs w:val="24"/>
+            </w:rPr>
+          </w:pPr>
+          <w:r>
+            <w:rPr>
+              <w:rFonts w:asciiTheme="majorHAnsi" w:hAnsiTheme="majorHAnsi" w:cstheme="majorHAnsi"/>
+              <w:b/>
+              <w:bCs/>
+              <w:sz w:val="24"/>
+              <w:szCs w:val="24"/>
+            </w:rPr>
+            <w:t>«</w:t>
+          </w:r>
+          <w:r>
+            <w:rPr>
+              <w:rFonts w:asciiTheme="majorHAnsi" w:hAnsiTheme="majorHAnsi" w:cstheme="majorHAnsi"/>
+              <w:b/>
+              <w:bCs/>
+              <w:sz w:val="24"/>
+              <w:szCs w:val="24"/>
+            </w:rPr>
+            <w:t xml:space="preserve">Applications of Machine Learning to Metabolomics Data </w:t>
+          </w:r>
+          <w:r>
+            <w:rPr>
+              <w:rFonts w:asciiTheme="majorHAnsi" w:hAnsiTheme="majorHAnsi" w:cstheme="majorHAnsi"/>
+              <w:b/>
+              <w:bCs/>
+              <w:sz w:val="24"/>
+              <w:szCs w:val="24"/>
+            </w:rPr>
+            <w:t>»</w:t>
+          </w:r>
+        </w:p>
+        <w:p>
+          <w:pPr>
+            <w:pStyle w:val="NoSpacing"/>
+            <w:jc w:val="center"/>
+            <w:rPr>
+              <w:rFonts w:asciiTheme="majorHAnsi" w:hAnsiTheme="majorHAnsi" w:cstheme="majorHAnsi"/>
+              <w:sz w:val="24"/>
+              <w:szCs w:val="24"/>
+            </w:rPr>
+          </w:pPr>
+        </w:p>
+        <w:p>
+          <w:pPr>
+            <w:pStyle w:val="NoSpacing"/>
+            <w:jc w:val="center"/>
+            <w:rPr>
+              <w:rFonts w:asciiTheme="majorHAnsi" w:hAnsiTheme="majorHAnsi" w:cstheme="majorHAnsi"/>
+              <w:color w:val="000000" w:themeColor="text1"/>
+              <w:sz w:val="24"/>
+              <w:szCs w:val="24"/>
+            </w:rPr>
+          </w:pPr>
+        </w:p>
+        <w:p>
+          <w:pPr>
+            <w:pStyle w:val="NoSpacing"/>
+            <w:jc w:val="center"/>
+            <w:rPr>
+              <w:rFonts w:asciiTheme="majorHAnsi" w:hAnsiTheme="majorHAnsi" w:cstheme="majorHAnsi"/>
+              <w:color w:val="000000" w:themeColor="text1"/>
+              <w:sz w:val="24"/>
+              <w:szCs w:val="24"/>
+              <w:lang w:val="el-GR"/>
+            </w:rPr>
+          </w:pPr>
+          <w:r>
+            <w:rPr>
+              <w:rFonts w:asciiTheme="majorHAnsi" w:hAnsiTheme="majorHAnsi" w:cstheme="majorHAnsi"/>
+              <w:color w:val="000000" w:themeColor="text1"/>
+              <w:sz w:val="24"/>
+              <w:szCs w:val="24"/>
+            </w:rPr>
+            <w:t>Zippidou</w:t>
+          </w:r>
+          <w:r>
+            <w:rPr>
+              <w:rFonts w:asciiTheme="majorHAnsi" w:hAnsiTheme="majorHAnsi" w:cstheme="majorHAnsi"/>
+              <w:color w:val="000000" w:themeColor="text1"/>
+              <w:sz w:val="24"/>
+              <w:szCs w:val="24"/>
+              <w:lang w:val="el-GR"/>
+            </w:rPr>
+            <w:t xml:space="preserve"> </w:t>
+          </w:r>
+          <w:r>
+            <w:rPr>
+              <w:rFonts w:asciiTheme="majorHAnsi" w:hAnsiTheme="majorHAnsi" w:cstheme="majorHAnsi"/>
+              <w:color w:val="000000" w:themeColor="text1"/>
+              <w:sz w:val="24"/>
+              <w:szCs w:val="24"/>
+            </w:rPr>
+            <w:t>Kyriaki</w:t>
+          </w:r>
+          <w:r>
+            <w:rPr>
+              <w:rFonts w:asciiTheme="majorHAnsi" w:hAnsiTheme="majorHAnsi" w:cstheme="majorHAnsi"/>
+              <w:color w:val="000000" w:themeColor="text1"/>
+              <w:sz w:val="24"/>
+              <w:szCs w:val="24"/>
+              <w:lang w:val="el-GR"/>
+            </w:rPr>
+            <w:t xml:space="preserve">, </w:t>
+          </w:r>
+          <w:r>
+            <w:rPr>
+              <w:rFonts w:asciiTheme="majorHAnsi" w:hAnsiTheme="majorHAnsi" w:cstheme="majorHAnsi"/>
+              <w:color w:val="000000" w:themeColor="text1"/>
+              <w:sz w:val="24"/>
+              <w:szCs w:val="24"/>
+            </w:rPr>
+            <w:t>Registration</w:t>
+          </w:r>
+          <w:r>
+            <w:rPr>
+              <w:rFonts w:asciiTheme="majorHAnsi" w:hAnsiTheme="majorHAnsi" w:cstheme="majorHAnsi"/>
+              <w:color w:val="000000" w:themeColor="text1"/>
+              <w:sz w:val="24"/>
+              <w:szCs w:val="24"/>
+              <w:lang w:val="el-GR"/>
+            </w:rPr>
+            <w:t xml:space="preserve"> </w:t>
+          </w:r>
+          <w:r>
+            <w:rPr>
+              <w:rFonts w:asciiTheme="majorHAnsi" w:hAnsiTheme="majorHAnsi" w:cstheme="majorHAnsi"/>
+              <w:color w:val="000000" w:themeColor="text1"/>
+              <w:sz w:val="24"/>
+              <w:szCs w:val="24"/>
+            </w:rPr>
+            <w:t>Number</w:t>
+          </w:r>
+          <w:r>
+            <w:rPr>
+              <w:rFonts w:asciiTheme="majorHAnsi" w:hAnsiTheme="majorHAnsi" w:cstheme="majorHAnsi"/>
+              <w:color w:val="000000" w:themeColor="text1"/>
+              <w:sz w:val="24"/>
+              <w:szCs w:val="24"/>
+              <w:lang w:val="el-GR"/>
+            </w:rPr>
+            <w:t>: 661</w:t>
+          </w:r>
+        </w:p>
+        <w:p>
+          <w:pPr>
+            <w:pStyle w:val="NoSpacing"/>
+            <w:jc w:val="center"/>
+            <w:rPr>
+              <w:rFonts w:asciiTheme="majorHAnsi" w:hAnsiTheme="majorHAnsi" w:cstheme="majorHAnsi"/>
+              <w:b/>
+              <w:bCs/>
+              <w:color w:val="000000" w:themeColor="text1"/>
+              <w:sz w:val="24"/>
+              <w:lang w:val="el-GR"/>
+            </w:rPr>
+          </w:pPr>
+        </w:p>
+        <w:p>
+          <w:pPr>
+            <w:pStyle w:val="NoSpacing"/>
+            <w:jc w:val="center"/>
+            <w:rPr>
+              <w:rFonts w:asciiTheme="majorHAnsi" w:hAnsiTheme="majorHAnsi" w:cstheme="majorHAnsi"/>
+              <w:b/>
+              <w:bCs/>
+              <w:color w:val="000000" w:themeColor="text1"/>
+              <w:sz w:val="24"/>
+              <w:lang w:val="el-GR"/>
+            </w:rPr>
+          </w:pPr>
+        </w:p>
+        <w:p>
+          <w:pPr>
+            <w:pStyle w:val="NoSpacing"/>
+            <w:jc w:val="center"/>
+            <w:rPr>
+              <w:rFonts w:asciiTheme="majorHAnsi" w:hAnsiTheme="majorHAnsi" w:cstheme="majorHAnsi"/>
+              <w:b/>
+              <w:bCs/>
+              <w:color w:val="000000" w:themeColor="text1"/>
+              <w:sz w:val="24"/>
+              <w:lang w:val="el-GR"/>
+            </w:rPr>
+          </w:pPr>
+        </w:p>
+        <w:p>
+          <w:pPr>
+            <w:pStyle w:val="NoSpacing"/>
+            <w:jc w:val="center"/>
+            <w:rPr>
+              <w:rFonts w:asciiTheme="majorHAnsi" w:hAnsiTheme="majorHAnsi" w:cstheme="majorHAnsi"/>
+              <w:color w:val="000000" w:themeColor="text1"/>
+              <w:szCs w:val="20"/>
+            </w:rPr>
+          </w:pPr>
+          <w:r>
+            <w:rPr>
+              <w:rFonts w:asciiTheme="majorHAnsi" w:hAnsiTheme="majorHAnsi" w:cstheme="majorHAnsi"/>
+              <w:color w:val="000000" w:themeColor="text1"/>
+              <w:szCs w:val="20"/>
+            </w:rPr>
+            <w:t xml:space="preserve">A thesis submitted in partial fulfilment of the requirements for the degree of </w:t>
+          </w:r>
+          <w:proofErr w:type="gramStart"/>
+          <w:r>
+            <w:rPr>
+              <w:rFonts w:asciiTheme="majorHAnsi" w:hAnsiTheme="majorHAnsi" w:cstheme="majorHAnsi"/>
+              <w:color w:val="000000" w:themeColor="text1"/>
+              <w:szCs w:val="20"/>
+            </w:rPr>
+            <w:t xml:space="preserve">Master in </w:t>
+          </w:r>
+          <w:r>
+            <w:rPr>
+              <w:rFonts w:asciiTheme="majorHAnsi" w:hAnsiTheme="majorHAnsi" w:cstheme="majorHAnsi"/>
+              <w:color w:val="000000" w:themeColor="text1"/>
+              <w:szCs w:val="20"/>
+            </w:rPr>
+            <w:t>Applied Bioinformatics</w:t>
+          </w:r>
+          <w:proofErr w:type="gramEnd"/>
+          <w:r>
+            <w:rPr>
+              <w:rFonts w:asciiTheme="majorHAnsi" w:hAnsiTheme="majorHAnsi" w:cstheme="majorHAnsi"/>
+              <w:color w:val="000000" w:themeColor="text1"/>
+              <w:szCs w:val="20"/>
+            </w:rPr>
+            <w:t xml:space="preserve"> </w:t>
+          </w:r>
+          <w:r>
+            <w:rPr>
+              <w:rFonts w:asciiTheme="majorHAnsi" w:hAnsiTheme="majorHAnsi" w:cstheme="majorHAnsi"/>
+              <w:color w:val="000000" w:themeColor="text1"/>
+              <w:szCs w:val="20"/>
+            </w:rPr>
+            <w:t xml:space="preserve">and </w:t>
+          </w:r>
+          <w:r>
+            <w:rPr>
+              <w:rFonts w:asciiTheme="majorHAnsi" w:hAnsiTheme="majorHAnsi" w:cstheme="majorHAnsi"/>
+              <w:color w:val="000000" w:themeColor="text1"/>
+              <w:szCs w:val="20"/>
+            </w:rPr>
+            <w:t>Biological Data Analysis</w:t>
+          </w:r>
+          <w:r>
+            <w:rPr>
+              <w:rFonts w:asciiTheme="majorHAnsi" w:hAnsiTheme="majorHAnsi" w:cstheme="majorHAnsi"/>
+              <w:color w:val="000000" w:themeColor="text1"/>
+              <w:szCs w:val="20"/>
+            </w:rPr>
+            <w:t xml:space="preserve">, </w:t>
+          </w:r>
+          <w:proofErr w:type="gramStart"/>
+          <w:r>
+            <w:rPr>
+              <w:rFonts w:asciiTheme="majorHAnsi" w:hAnsiTheme="majorHAnsi" w:cstheme="majorHAnsi"/>
+              <w:color w:val="000000" w:themeColor="text1"/>
+              <w:szCs w:val="20"/>
+            </w:rPr>
+            <w:t>Department  of</w:t>
+          </w:r>
+          <w:proofErr w:type="gramEnd"/>
+          <w:r>
+            <w:rPr>
+              <w:rFonts w:asciiTheme="majorHAnsi" w:hAnsiTheme="majorHAnsi" w:cstheme="majorHAnsi"/>
+              <w:color w:val="000000" w:themeColor="text1"/>
+              <w:szCs w:val="20"/>
+            </w:rPr>
+            <w:t xml:space="preserve"> Molecular Biology and Genetics, Democritus University of Thrace</w:t>
+          </w:r>
+        </w:p>
+        <w:p>
+          <w:pPr>
+            <w:pStyle w:val="NoSpacing"/>
+            <w:jc w:val="center"/>
+            <w:rPr>
+              <w:rFonts w:asciiTheme="majorHAnsi" w:hAnsiTheme="majorHAnsi" w:cstheme="majorHAnsi"/>
+              <w:b/>
+              <w:bCs/>
+              <w:color w:val="000000" w:themeColor="text1"/>
+              <w:sz w:val="24"/>
+            </w:rPr>
+          </w:pPr>
+        </w:p>
+        <w:p>
+          <w:pPr>
+            <w:pStyle w:val="NoSpacing"/>
+            <w:jc w:val="center"/>
+            <w:rPr>
+              <w:rFonts w:asciiTheme="majorHAnsi" w:hAnsiTheme="majorHAnsi" w:cstheme="majorHAnsi"/>
+              <w:b/>
+              <w:bCs/>
+              <w:color w:val="000000" w:themeColor="text1"/>
+              <w:sz w:val="24"/>
+            </w:rPr>
+          </w:pPr>
+        </w:p>
+        <w:p>
+          <w:pPr>
+            <w:pStyle w:val="NoSpacing"/>
+            <w:jc w:val="center"/>
+            <w:rPr>
+              <w:rFonts w:asciiTheme="majorHAnsi" w:hAnsiTheme="majorHAnsi" w:cstheme="majorHAnsi"/>
+              <w:b/>
+              <w:bCs/>
+              <w:color w:val="000000" w:themeColor="text1"/>
+              <w:sz w:val="24"/>
+            </w:rPr>
+          </w:pPr>
+        </w:p>
+        <w:p>
+          <w:pPr>
+            <w:pStyle w:val="NoSpacing"/>
+            <w:jc w:val="center"/>
+            <w:rPr>
+              <w:rFonts w:asciiTheme="majorHAnsi" w:hAnsiTheme="majorHAnsi" w:cstheme="majorHAnsi"/>
+              <w:color w:val="000000" w:themeColor="text1"/>
+              <w:sz w:val="24"/>
+            </w:rPr>
+          </w:pPr>
+          <w:r>
+            <w:rPr>
+              <w:rFonts w:asciiTheme="majorHAnsi" w:hAnsiTheme="majorHAnsi" w:cstheme="majorHAnsi"/>
+              <w:color w:val="000000" w:themeColor="text1"/>
+              <w:sz w:val="24"/>
+            </w:rPr>
+            <w:t>COMMITTEE OF EXAMINERS</w:t>
+          </w:r>
+        </w:p>
+        <w:p>
+          <w:pPr>
+            <w:pStyle w:val="NoSpacing"/>
+            <w:jc w:val="center"/>
+            <w:rPr>
+              <w:rFonts w:asciiTheme="majorHAnsi" w:hAnsiTheme="majorHAnsi" w:cstheme="majorHAnsi"/>
+              <w:color w:val="000000" w:themeColor="text1"/>
+              <w:sz w:val="24"/>
+            </w:rPr>
+          </w:pPr>
+        </w:p>
+        <w:p>
+          <w:pPr>
+            <w:pStyle w:val="NoSpacing"/>
+            <w:jc w:val="center"/>
+            <w:rPr>
+              <w:rFonts w:asciiTheme="majorHAnsi" w:hAnsiTheme="majorHAnsi" w:cstheme="majorHAnsi"/>
+              <w:color w:val="000000" w:themeColor="text1"/>
+              <w:sz w:val="24"/>
+            </w:rPr>
+          </w:pPr>
+          <w:r>
+            <w:rPr>
+              <w:rFonts w:asciiTheme="majorHAnsi" w:hAnsiTheme="majorHAnsi" w:cstheme="majorHAnsi"/>
+              <w:color w:val="000000" w:themeColor="text1"/>
+              <w:sz w:val="24"/>
+            </w:rPr>
+            <w:t>Supervisor</w:t>
+          </w:r>
+          <w:r>
+            <w:rPr>
+              <w:rFonts w:asciiTheme="majorHAnsi" w:hAnsiTheme="majorHAnsi" w:cstheme="majorHAnsi"/>
+              <w:color w:val="000000" w:themeColor="text1"/>
+              <w:sz w:val="24"/>
+            </w:rPr>
+            <w:t xml:space="preserve">: </w:t>
+          </w:r>
+          <w:proofErr w:type="spellStart"/>
+          <w:r>
+            <w:rPr>
+              <w:rFonts w:asciiTheme="majorHAnsi" w:hAnsiTheme="majorHAnsi" w:cstheme="majorHAnsi"/>
+              <w:color w:val="000000" w:themeColor="text1"/>
+              <w:sz w:val="24"/>
+            </w:rPr>
+            <w:t>Psomopoulos</w:t>
+          </w:r>
+          <w:proofErr w:type="spellEnd"/>
+          <w:r>
+            <w:rPr>
+              <w:rFonts w:asciiTheme="majorHAnsi" w:hAnsiTheme="majorHAnsi" w:cstheme="majorHAnsi"/>
+              <w:color w:val="000000" w:themeColor="text1"/>
+              <w:sz w:val="24"/>
+            </w:rPr>
+            <w:t xml:space="preserve"> Fotis, Senior Researcher, INAB/CERTH</w:t>
+          </w:r>
+        </w:p>
+        <w:p>
+          <w:pPr>
+            <w:pStyle w:val="NoSpacing"/>
+            <w:rPr>
+              <w:rFonts w:asciiTheme="majorHAnsi" w:hAnsiTheme="majorHAnsi" w:cstheme="majorHAnsi"/>
+              <w:color w:val="000000" w:themeColor="text1"/>
+              <w:sz w:val="24"/>
+            </w:rPr>
+          </w:pPr>
+          <w:r>
+            <w:rPr>
+              <w:rFonts w:asciiTheme="majorHAnsi" w:hAnsiTheme="majorHAnsi" w:cstheme="majorHAnsi"/>
+              <w:color w:val="000000" w:themeColor="text1"/>
+              <w:sz w:val="24"/>
+            </w:rPr>
+            <w:tab/>
+            <w:t xml:space="preserve">        </w:t>
+          </w:r>
+          <w:r>
+            <w:rPr>
+              <w:rFonts w:asciiTheme="majorHAnsi" w:hAnsiTheme="majorHAnsi" w:cstheme="majorHAnsi"/>
+              <w:color w:val="000000" w:themeColor="text1"/>
+              <w:sz w:val="24"/>
+            </w:rPr>
+            <w:t xml:space="preserve">     </w:t>
+          </w:r>
+          <w:r>
+            <w:rPr>
+              <w:rFonts w:asciiTheme="majorHAnsi" w:hAnsiTheme="majorHAnsi" w:cstheme="majorHAnsi"/>
+              <w:color w:val="000000" w:themeColor="text1"/>
+              <w:sz w:val="24"/>
+            </w:rPr>
+            <w:t xml:space="preserve">Member </w:t>
+          </w:r>
+          <w:r>
+            <w:rPr>
+              <w:rFonts w:asciiTheme="majorHAnsi" w:hAnsiTheme="majorHAnsi" w:cstheme="majorHAnsi"/>
+              <w:color w:val="000000" w:themeColor="text1"/>
+              <w:sz w:val="24"/>
+            </w:rPr>
+            <w:t xml:space="preserve">2: </w:t>
+          </w:r>
+          <w:r>
+            <w:rPr>
+              <w:rFonts w:asciiTheme="majorHAnsi" w:hAnsiTheme="majorHAnsi" w:cstheme="majorHAnsi"/>
+              <w:color w:val="000000" w:themeColor="text1"/>
+              <w:sz w:val="24"/>
+            </w:rPr>
+            <w:t xml:space="preserve">Klapa Maria, </w:t>
+          </w:r>
+          <w:r>
+            <w:rPr>
+              <w:rFonts w:asciiTheme="majorHAnsi" w:hAnsiTheme="majorHAnsi" w:cstheme="majorHAnsi"/>
+              <w:color w:val="000000" w:themeColor="text1"/>
+              <w:sz w:val="24"/>
+            </w:rPr>
+            <w:t>FORTH/ICE-HT</w:t>
+          </w:r>
+        </w:p>
+        <w:p>
+          <w:pPr>
+            <w:pStyle w:val="NoSpacing"/>
+            <w:jc w:val="center"/>
+            <w:rPr>
+              <w:rFonts w:asciiTheme="majorHAnsi" w:hAnsiTheme="majorHAnsi" w:cstheme="majorHAnsi"/>
+              <w:b/>
+              <w:bCs/>
+              <w:color w:val="000000" w:themeColor="text1"/>
+              <w:sz w:val="24"/>
+            </w:rPr>
+          </w:pPr>
+        </w:p>
+        <w:p>
+          <w:pPr>
+            <w:pStyle w:val="NoSpacing"/>
+            <w:jc w:val="center"/>
+            <w:rPr>
+              <w:rFonts w:asciiTheme="majorHAnsi" w:hAnsiTheme="majorHAnsi" w:cstheme="majorHAnsi"/>
+              <w:b/>
+              <w:bCs/>
+              <w:color w:val="000000" w:themeColor="text1"/>
+              <w:sz w:val="24"/>
+            </w:rPr>
+          </w:pPr>
+        </w:p>
+        <w:p>
+          <w:pPr>
+            <w:pStyle w:val="NoSpacing"/>
+            <w:jc w:val="center"/>
+            <w:rPr>
+              <w:rFonts w:asciiTheme="majorHAnsi" w:hAnsiTheme="majorHAnsi" w:cstheme="majorHAnsi"/>
+              <w:b/>
+              <w:bCs/>
+              <w:color w:val="000000" w:themeColor="text1"/>
+              <w:sz w:val="24"/>
+            </w:rPr>
+          </w:pPr>
+        </w:p>
+        <w:p>
+          <w:pPr>
+            <w:pStyle w:val="NoSpacing"/>
+            <w:jc w:val="center"/>
+            <w:rPr>
+              <w:rFonts w:asciiTheme="majorHAnsi" w:hAnsiTheme="majorHAnsi" w:cstheme="majorHAnsi"/>
+              <w:color w:val="000000" w:themeColor="text1"/>
+              <w:sz w:val="24"/>
+              <w:lang w:val="el-GR"/>
+            </w:rPr>
+          </w:pPr>
+          <w:r>
+            <w:rPr>
+              <w:rFonts w:asciiTheme="majorHAnsi" w:hAnsiTheme="majorHAnsi" w:cstheme="majorHAnsi"/>
+              <w:color w:val="000000" w:themeColor="text1"/>
+              <w:sz w:val="24"/>
+            </w:rPr>
+            <w:t xml:space="preserve">Thessaloniki, </w:t>
+          </w:r>
+          <w:proofErr w:type="gramStart"/>
+          <w:r>
+            <w:rPr>
+              <w:rFonts w:asciiTheme="majorHAnsi" w:hAnsiTheme="majorHAnsi" w:cstheme="majorHAnsi"/>
+              <w:color w:val="000000" w:themeColor="text1"/>
+              <w:sz w:val="24"/>
+            </w:rPr>
+            <w:t>September</w:t>
+          </w:r>
+          <w:r>
+            <w:rPr>
+              <w:rFonts w:asciiTheme="majorHAnsi" w:hAnsiTheme="majorHAnsi" w:cstheme="majorHAnsi"/>
+              <w:color w:val="000000" w:themeColor="text1"/>
+              <w:sz w:val="24"/>
+              <w:lang w:val="el-GR"/>
+            </w:rPr>
+            <w:t>,</w:t>
+          </w:r>
+          <w:proofErr w:type="gramEnd"/>
+          <w:r>
+            <w:rPr>
+              <w:rFonts w:asciiTheme="majorHAnsi" w:hAnsiTheme="majorHAnsi" w:cstheme="majorHAnsi"/>
+              <w:color w:val="000000" w:themeColor="text1"/>
+              <w:sz w:val="24"/>
+              <w:lang w:val="el-GR"/>
+            </w:rPr>
+            <w:t xml:space="preserve"> 2026</w:t>
+          </w:r>
+        </w:p>
+        <w:p>
+          <w:pPr>
+            <w:tabs>
+              <w:tab w:val="left" w:pos="1308"/>
+            </w:tabs>
+            <w:spacing w:after="200" w:line="276" w:lineRule="auto"/>
+            <w:ind w:firstLine="0"/>
+            <w:jc w:val="both"/>
+            <w:rPr>
+              <w:rFonts w:asciiTheme="majorHAnsi" w:hAnsiTheme="majorHAnsi" w:cstheme="majorHAnsi"/>
+              <w:b/>
+              <w:bCs/>
+              <w:lang w:val="el-GR"/>
+            </w:rPr>
+          </w:pPr>
+          <w:r>
+            <w:rPr>
+              <w:rFonts w:asciiTheme="majorHAnsi" w:hAnsiTheme="majorHAnsi" w:cstheme="majorHAnsi"/>
+              <w:lang w:val="el-GR"/>
+            </w:rPr>
+            <w:br w:type="page"/>
+          </w:r>
+          <w:r>
+            <w:rPr>
+              <w:rFonts w:asciiTheme="majorHAnsi" w:hAnsiTheme="majorHAnsi" w:cstheme="majorHAnsi"/>
+              <w:b/>
+              <w:bCs/>
+              <w:lang w:val="el-GR"/>
+            </w:rPr>
+            <w:lastRenderedPageBreak/>
+            <w:t>Ευχαριστίες</w:t>
+          </w:r>
+        </w:p>
+        <w:p>
+          <w:pPr>
+            <w:tabs>
+              <w:tab w:val="left" w:pos="1308"/>
+            </w:tabs>
+            <w:spacing w:after="200" w:line="276" w:lineRule="auto"/>
+            <w:ind w:firstLine="0"/>
+            <w:jc w:val="center"/>
+            <w:rPr>
+              <w:rFonts w:asciiTheme="majorHAnsi" w:hAnsiTheme="majorHAnsi" w:cstheme="majorHAnsi"/>
+              <w:lang w:val="el-GR"/>
+            </w:rPr>
+          </w:pPr>
+          <w:r>
+            <w:rPr>
+              <w:rFonts w:asciiTheme="majorHAnsi" w:hAnsiTheme="majorHAnsi" w:cstheme="majorHAnsi"/>
+              <w:lang w:val="el-GR"/>
+            </w:rPr>
+            <w:t>Με την παρούσα διπλωματική εργασία ολοκληρώνονται οι σπουδές μου στο μεταπτυχιακό πρόγραμμα σπουδών «</w:t>
+          </w:r>
+          <w:r>
+            <w:rPr>
+              <w:rFonts w:asciiTheme="majorHAnsi" w:hAnsiTheme="majorHAnsi" w:cstheme="majorHAnsi"/>
+              <w:lang w:val="el-GR"/>
+            </w:rPr>
+            <w:t xml:space="preserve">Εφαρμοσμένη Βιοπληροφορική </w:t>
+          </w:r>
+          <w:r>
+            <w:rPr>
+              <w:rFonts w:asciiTheme="majorHAnsi" w:hAnsiTheme="majorHAnsi" w:cstheme="majorHAnsi"/>
+              <w:lang w:val="el-GR"/>
+            </w:rPr>
+            <w:t xml:space="preserve">και </w:t>
+          </w:r>
+          <w:r>
+            <w:rPr>
+              <w:rFonts w:asciiTheme="majorHAnsi" w:hAnsiTheme="majorHAnsi" w:cstheme="majorHAnsi"/>
+              <w:lang w:val="el-GR"/>
+            </w:rPr>
+            <w:t>Ανάλυση Βιολογικών Δεδομένων</w:t>
+          </w:r>
+          <w:r>
+            <w:rPr>
+              <w:rFonts w:asciiTheme="majorHAnsi" w:hAnsiTheme="majorHAnsi" w:cstheme="majorHAnsi"/>
+              <w:lang w:val="el-GR"/>
+            </w:rPr>
+            <w:t>», του Τμήματος Μοριακής Βιολογίας και Γενετικής του Δημοκρίτειου Πανεπιστημίου Θράκης.</w:t>
+          </w:r>
+        </w:p>
+        <w:p>
+          <w:pPr>
+            <w:tabs>
+              <w:tab w:val="left" w:pos="1308"/>
+            </w:tabs>
+            <w:spacing w:after="200" w:line="276" w:lineRule="auto"/>
+            <w:ind w:firstLine="0"/>
+            <w:jc w:val="center"/>
+            <w:rPr>
+              <w:rFonts w:asciiTheme="majorHAnsi" w:hAnsiTheme="majorHAnsi" w:cstheme="majorHAnsi"/>
+              <w:lang w:val="el-GR"/>
+            </w:rPr>
+          </w:pPr>
+          <w:r>
+            <w:rPr>
+              <w:rFonts w:asciiTheme="majorHAnsi" w:hAnsiTheme="majorHAnsi" w:cstheme="majorHAnsi"/>
+              <w:lang w:val="el-GR"/>
+            </w:rPr>
+            <w:t>Θα ήθελα να εκφράσω τις ευχαριστίες μου προς τον κ. Φώτη Ψωμόπουλο, ερευνητή του ΕΚΕΤΑ, για το ενδιαφέρον και την βοήθεια του στην ολοκλήρωση της διπλωματικής εργασίας μου, για την επιστημονική και συμβουλευτική καθοδήγηση που μου προσέφερε.</w:t>
+          </w:r>
+        </w:p>
+        <w:p>
+          <w:pPr>
+            <w:tabs>
+              <w:tab w:val="left" w:pos="1308"/>
+            </w:tabs>
+            <w:spacing w:after="200" w:line="276" w:lineRule="auto"/>
+            <w:ind w:firstLine="0"/>
+            <w:jc w:val="center"/>
+            <w:rPr>
+              <w:rFonts w:asciiTheme="majorHAnsi" w:hAnsiTheme="majorHAnsi" w:cstheme="majorHAnsi"/>
+              <w:lang w:val="el-GR"/>
+            </w:rPr>
+          </w:pPr>
+          <w:r>
+            <w:rPr>
+              <w:rFonts w:asciiTheme="majorHAnsi" w:hAnsiTheme="majorHAnsi" w:cstheme="majorHAnsi"/>
+              <w:lang w:val="el-GR"/>
+            </w:rPr>
+            <w:t>Επιπλέον, θα ήθελα να ευχαριστήσω θερμά όλους τους καθηγητές και συμφοιτητές του συγκεκριμένου προγράμματος σπουδών για το περιβάλλον γνώσεων και εμπειριών, χωρίς τη βοήθεια των οποίων δε θα ήταν δυνατή η διεκπεραίωση των σπουδών μου.</w:t>
+          </w:r>
+        </w:p>
+        <w:p>
+          <w:pPr>
+            <w:tabs>
+              <w:tab w:val="left" w:pos="1308"/>
+            </w:tabs>
+            <w:spacing w:after="200" w:line="276" w:lineRule="auto"/>
+            <w:ind w:firstLine="0"/>
+            <w:jc w:val="center"/>
+            <w:rPr>
+              <w:rFonts w:asciiTheme="majorHAnsi" w:eastAsiaTheme="majorEastAsia" w:hAnsiTheme="majorHAnsi" w:cstheme="majorHAnsi"/>
+              <w:b/>
+              <w:bCs/>
+              <w:color w:val="365F91" w:themeColor="accent1" w:themeShade="BF"/>
+              <w:sz w:val="30"/>
+              <w:szCs w:val="28"/>
+              <w:lang w:val="el-GR"/>
+            </w:rPr>
+          </w:pPr>
+          <w:r>
+            <w:rPr>
+              <w:rFonts w:asciiTheme="majorHAnsi" w:hAnsiTheme="majorHAnsi" w:cstheme="majorHAnsi"/>
+              <w:lang w:val="el-GR"/>
+            </w:rPr>
+            <w:t xml:space="preserve">Τέλος, </w:t>
+          </w:r>
+          <w:r>
+            <w:rPr>
+              <w:rFonts w:asciiTheme="majorHAnsi" w:hAnsiTheme="majorHAnsi" w:cstheme="majorHAnsi"/>
+              <w:lang w:val="el-GR"/>
+            </w:rPr>
+            <w:t>οφείλω να ευχαριστήσω την οικογένεια μου, για τη συμπαράσταση και την υπομονή τους.</w:t>
+          </w:r>
+        </w:p>
+      </w:sdtContent>
+    </w:sdt>
+    <w:p>
+      <w:pPr>
+        <w:spacing w:after="200" w:line="276" w:lineRule="auto"/>
+        <w:ind w:firstLine="0"/>
+        <w:rPr>
+          <w:rFonts w:asciiTheme="majorHAnsi" w:eastAsiaTheme="majorEastAsia" w:hAnsiTheme="majorHAnsi" w:cstheme="majorBidi"/>
+          <w:b/>
+          <w:bCs/>
+          <w:color w:val="365F91" w:themeColor="accent1" w:themeShade="BF"/>
+          <w:sz w:val="30"/>
+          <w:szCs w:val="28"/>
+          <w:lang w:val="el-GR"/>
+        </w:rPr>
+      </w:pPr>
+      <w:r>
+        <w:rPr>
+          <w:lang w:val="el-GR"/>
+        </w:rPr>
+        <w:br w:type="page"/>
+      </w:r>
+    </w:p>
     <w:p>
       <w:pPr>
         <w:pStyle w:val="Heading1"/>
@@ -14,6 +2535,7 @@
         <w:rPr>
           <w:lang w:val="el-GR"/>
         </w:rPr>
+        <w:lastRenderedPageBreak/>
         <w:t>1</w:t>
       </w:r>
       <w:r>
@@ -5672,6 +8194,7 @@
         </w:rPr>
         <w:t xml:space="preserve">̃ − </w:t>
       </w:r>
+      <w:proofErr w:type="gramStart"/>
       <w:r>
         <w:rPr>
           <w:i/>
@@ -5685,6 +8208,7 @@
         </w:rPr>
         <w:t>)^</w:t>
       </w:r>
+      <w:proofErr w:type="gramEnd"/>
       <w:r>
         <w:rPr>
           <w:i/>
@@ -7575,6 +10099,7 @@
         </w:rPr>
         <w:t>i</w:t>
       </w:r>
+      <w:proofErr w:type="gramStart"/>
       <w:r>
         <w:rPr>
           <w:i/>
@@ -7602,6 +10127,7 @@
         </w:rPr>
         <w:t xml:space="preserve"> λύσης</w:t>
       </w:r>
+      <w:proofErr w:type="gramEnd"/>
     </w:p>
     <w:p>
       <w:pPr>
@@ -9892,7 +12418,43 @@
           <w:i/>
         </w:rPr>
         <w:lastRenderedPageBreak/>
-        <w:t>min Σ w_k (y_k,meas − y_k,sim)²</w:t>
+        <w:t>min Σ w_k (y_</w:t>
+      </w:r>
+      <w:proofErr w:type="gramStart"/>
+      <w:r>
+        <w:rPr>
+          <w:i/>
+        </w:rPr>
+        <w:t>k,meas</w:t>
+      </w:r>
+      <w:proofErr w:type="gramEnd"/>
+      <w:r>
+        <w:rPr>
+          <w:i/>
+        </w:rPr>
+        <w:t xml:space="preserve"> − </w:t>
+      </w:r>
+      <w:proofErr w:type="spellStart"/>
+      <w:r>
+        <w:rPr>
+          <w:i/>
+        </w:rPr>
+        <w:t>y_</w:t>
+      </w:r>
+      <w:proofErr w:type="gramStart"/>
+      <w:r>
+        <w:rPr>
+          <w:i/>
+        </w:rPr>
+        <w:t>k,sim</w:t>
+      </w:r>
+      <w:proofErr w:type="spellEnd"/>
+      <w:proofErr w:type="gramEnd"/>
+      <w:r>
+        <w:rPr>
+          <w:i/>
+        </w:rPr>
+        <w:t>)²</w:t>
       </w:r>
     </w:p>
     <w:p>
@@ -9926,9 +12488,11 @@
         </w:rPr>
         <w:t>,</w:t>
       </w:r>
+      <w:proofErr w:type="spellStart"/>
       <w:r>
         <w:t>meas</w:t>
       </w:r>
+      <w:proofErr w:type="spellEnd"/>
       <w:r>
         <w:rPr>
           <w:lang w:val="el-GR"/>
@@ -13657,7 +16221,21 @@
         <w:rPr>
           <w:sz w:val="21"/>
         </w:rPr>
-        <w:t>1. Tolani P, Gupta S, Yadav K, Aggarwal S, Yadav AK. Big data, integrative omics and network biology. Advances in Protein Chemistry and Structural Biology. 2021;127:127–160.</w:t>
+        <w:t xml:space="preserve">1. Tolani P, Gupta S, Yadav K, Aggarwal S, Yadav AK. Big data, integrative omics and network biology. Advances in Protein Chemistry and Structural Biology. </w:t>
+      </w:r>
+      <w:proofErr w:type="gramStart"/>
+      <w:r>
+        <w:rPr>
+          <w:sz w:val="21"/>
+        </w:rPr>
+        <w:t>2021;127:127</w:t>
+      </w:r>
+      <w:proofErr w:type="gramEnd"/>
+      <w:r>
+        <w:rPr>
+          <w:sz w:val="21"/>
+        </w:rPr>
+        <w:t>–160.</w:t>
       </w:r>
     </w:p>
     <w:p>
@@ -13683,7 +16261,49 @@
         <w:rPr>
           <w:sz w:val="21"/>
         </w:rPr>
-        <w:t>3. Emwas AH, Szczepski K, Al-Younis I, Lachowicz JI, Jaremko M. Fluxomics — New Metabolomics Approaches to Monitor Metabolic Pathways. Frontiers in Pharmacology. 2022;13:805782.</w:t>
+        <w:t xml:space="preserve">3. </w:t>
+      </w:r>
+      <w:proofErr w:type="spellStart"/>
+      <w:r>
+        <w:rPr>
+          <w:sz w:val="21"/>
+        </w:rPr>
+        <w:t>Emwas</w:t>
+      </w:r>
+      <w:proofErr w:type="spellEnd"/>
+      <w:r>
+        <w:rPr>
+          <w:sz w:val="21"/>
+        </w:rPr>
+        <w:t xml:space="preserve"> AH, </w:t>
+      </w:r>
+      <w:proofErr w:type="spellStart"/>
+      <w:r>
+        <w:rPr>
+          <w:sz w:val="21"/>
+        </w:rPr>
+        <w:t>Szczepski</w:t>
+      </w:r>
+      <w:proofErr w:type="spellEnd"/>
+      <w:r>
+        <w:rPr>
+          <w:sz w:val="21"/>
+        </w:rPr>
+        <w:t xml:space="preserve"> K, Al-Younis I, Lachowicz JI, Jaremko M. Fluxomics — New Metabolomics Approaches to Monitor Metabolic Pathways. Frontiers in Pharmacology. </w:t>
+      </w:r>
+      <w:proofErr w:type="gramStart"/>
+      <w:r>
+        <w:rPr>
+          <w:sz w:val="21"/>
+        </w:rPr>
+        <w:t>2022;13:805782</w:t>
+      </w:r>
+      <w:proofErr w:type="gramEnd"/>
+      <w:r>
+        <w:rPr>
+          <w:sz w:val="21"/>
+        </w:rPr>
+        <w:t>.</w:t>
       </w:r>
     </w:p>
     <w:p>
@@ -13696,7 +16316,21 @@
         <w:rPr>
           <w:sz w:val="21"/>
         </w:rPr>
-        <w:t>4. Sauer U. Metabolic networks in motion: ¹³C-based flux analysis. Molecular Systems Biology. 2006;2:62.</w:t>
+        <w:t xml:space="preserve">4. Sauer U. Metabolic networks in motion: ¹³C-based flux analysis. Molecular Systems Biology. </w:t>
+      </w:r>
+      <w:proofErr w:type="gramStart"/>
+      <w:r>
+        <w:rPr>
+          <w:sz w:val="21"/>
+        </w:rPr>
+        <w:t>2006;2:62</w:t>
+      </w:r>
+      <w:proofErr w:type="gramEnd"/>
+      <w:r>
+        <w:rPr>
+          <w:sz w:val="21"/>
+        </w:rPr>
+        <w:t>.</w:t>
       </w:r>
     </w:p>
     <w:p>
@@ -13722,7 +16356,49 @@
         <w:rPr>
           <w:sz w:val="21"/>
         </w:rPr>
-        <w:t>6. Niedenführ S, Wiechert W, Nöh K. How to measure metabolic fluxes: a taxonomic guide for ¹³C fluxomics. Current Opinion in Biotechnology. 2015;34:82–90.</w:t>
+        <w:t xml:space="preserve">6. </w:t>
+      </w:r>
+      <w:proofErr w:type="spellStart"/>
+      <w:r>
+        <w:rPr>
+          <w:sz w:val="21"/>
+        </w:rPr>
+        <w:t>Niedenführ</w:t>
+      </w:r>
+      <w:proofErr w:type="spellEnd"/>
+      <w:r>
+        <w:rPr>
+          <w:sz w:val="21"/>
+        </w:rPr>
+        <w:t xml:space="preserve"> S, Wiechert W, </w:t>
+      </w:r>
+      <w:proofErr w:type="spellStart"/>
+      <w:r>
+        <w:rPr>
+          <w:sz w:val="21"/>
+        </w:rPr>
+        <w:t>Nöh</w:t>
+      </w:r>
+      <w:proofErr w:type="spellEnd"/>
+      <w:r>
+        <w:rPr>
+          <w:sz w:val="21"/>
+        </w:rPr>
+        <w:t xml:space="preserve"> K. How to measure metabolic fluxes: a taxonomic guide for ¹³C fluxomics. Current Opinion in Biotechnology. </w:t>
+      </w:r>
+      <w:proofErr w:type="gramStart"/>
+      <w:r>
+        <w:rPr>
+          <w:sz w:val="21"/>
+        </w:rPr>
+        <w:t>2015;34:82</w:t>
+      </w:r>
+      <w:proofErr w:type="gramEnd"/>
+      <w:r>
+        <w:rPr>
+          <w:sz w:val="21"/>
+        </w:rPr>
+        <w:t>–90.</w:t>
       </w:r>
     </w:p>
     <w:p>
@@ -13735,7 +16411,35 @@
         <w:rPr>
           <w:sz w:val="21"/>
         </w:rPr>
-        <w:t>7. Wu C, Cano M, Gao X, Lo J, Maness P-C, Xiong W. A quantitative lens on anaerobic life: leveraging the state-of-the-art fluxomics approach to explore clostridial metabolism. Current Opinion in Biotechnology. 2020;64:47–54.</w:t>
+        <w:t xml:space="preserve">7. Wu C, </w:t>
+      </w:r>
+      <w:proofErr w:type="spellStart"/>
+      <w:r>
+        <w:rPr>
+          <w:sz w:val="21"/>
+        </w:rPr>
+        <w:t>Cano</w:t>
+      </w:r>
+      <w:proofErr w:type="spellEnd"/>
+      <w:r>
+        <w:rPr>
+          <w:sz w:val="21"/>
+        </w:rPr>
+        <w:t xml:space="preserve"> M, Gao X, Lo J, Maness P-C, Xiong W. A quantitative lens on anaerobic life: leveraging the state-of-the-art fluxomics approach to explore clostridial metabolism. Current Opinion in Biotechnology. </w:t>
+      </w:r>
+      <w:proofErr w:type="gramStart"/>
+      <w:r>
+        <w:rPr>
+          <w:sz w:val="21"/>
+        </w:rPr>
+        <w:t>2020;64:47</w:t>
+      </w:r>
+      <w:proofErr w:type="gramEnd"/>
+      <w:r>
+        <w:rPr>
+          <w:sz w:val="21"/>
+        </w:rPr>
+        <w:t>–54.</w:t>
       </w:r>
     </w:p>
     <w:p>
@@ -13748,7 +16452,35 @@
         <w:rPr>
           <w:sz w:val="21"/>
         </w:rPr>
-        <w:t>8. Klapa M, Pantziri M, Karakitsou E. Mathematical Concepts of Fluxomics. Metabolic Engineering &amp; Systems Biology Laboratory, FORTH/ICE-HT, Patras, Greece. Lecture notes.</w:t>
+        <w:t xml:space="preserve">8. Klapa M, </w:t>
+      </w:r>
+      <w:proofErr w:type="spellStart"/>
+      <w:r>
+        <w:rPr>
+          <w:sz w:val="21"/>
+        </w:rPr>
+        <w:t>Pantziri</w:t>
+      </w:r>
+      <w:proofErr w:type="spellEnd"/>
+      <w:r>
+        <w:rPr>
+          <w:sz w:val="21"/>
+        </w:rPr>
+        <w:t xml:space="preserve"> M, </w:t>
+      </w:r>
+      <w:proofErr w:type="spellStart"/>
+      <w:r>
+        <w:rPr>
+          <w:sz w:val="21"/>
+        </w:rPr>
+        <w:t>Karakitsou</w:t>
+      </w:r>
+      <w:proofErr w:type="spellEnd"/>
+      <w:r>
+        <w:rPr>
+          <w:sz w:val="21"/>
+        </w:rPr>
+        <w:t xml:space="preserve"> E. Mathematical Concepts of Fluxomics. Metabolic Engineering &amp; Systems Biology Laboratory, FORTH/ICE-HT, Patras, Greece. Lecture notes.</w:t>
       </w:r>
     </w:p>
     <w:p>
@@ -13774,7 +16506,35 @@
         <w:rPr>
           <w:sz w:val="21"/>
         </w:rPr>
-        <w:t>10. Antoniewicz MR. Methods and advances in metabolic flux analysis: a mini-review. Journal of Industrial Microbiology &amp; Biotechnology. 2015;42:317–325.</w:t>
+        <w:t xml:space="preserve">10. Antoniewicz MR. Methods and advances in metabolic flux analysis: a </w:t>
+      </w:r>
+      <w:proofErr w:type="gramStart"/>
+      <w:r>
+        <w:rPr>
+          <w:sz w:val="21"/>
+        </w:rPr>
+        <w:t>mini-review</w:t>
+      </w:r>
+      <w:proofErr w:type="gramEnd"/>
+      <w:r>
+        <w:rPr>
+          <w:sz w:val="21"/>
+        </w:rPr>
+        <w:t xml:space="preserve">. Journal of Industrial Microbiology &amp; Biotechnology. </w:t>
+      </w:r>
+      <w:proofErr w:type="gramStart"/>
+      <w:r>
+        <w:rPr>
+          <w:sz w:val="21"/>
+        </w:rPr>
+        <w:t>2015;42:317</w:t>
+      </w:r>
+      <w:proofErr w:type="gramEnd"/>
+      <w:r>
+        <w:rPr>
+          <w:sz w:val="21"/>
+        </w:rPr>
+        <w:t>–325.</w:t>
       </w:r>
     </w:p>
     <w:p>
@@ -13787,7 +16547,21 @@
         <w:rPr>
           <w:sz w:val="21"/>
         </w:rPr>
-        <w:t>11. Klapa MI, Park SM, Sinskey AJ, Stephanopoulos G. Metabolite and isotopomer balancing in the analysis of metabolic cycles. Biotechnology and Bioengineering. 1999;62(4):375–391.</w:t>
+        <w:t xml:space="preserve">11. Klapa MI, Park SM, </w:t>
+      </w:r>
+      <w:proofErr w:type="spellStart"/>
+      <w:r>
+        <w:rPr>
+          <w:sz w:val="21"/>
+        </w:rPr>
+        <w:t>Sinskey</w:t>
+      </w:r>
+      <w:proofErr w:type="spellEnd"/>
+      <w:r>
+        <w:rPr>
+          <w:sz w:val="21"/>
+        </w:rPr>
+        <w:t xml:space="preserve"> AJ, Stephanopoulos G. Metabolite and isotopomer balancing in the analysis of metabolic cycles. Biotechnology and Bioengineering. 1999;62(4):375–391.</w:t>
       </w:r>
     </w:p>
     <w:p>
@@ -13878,7 +16652,21 @@
         <w:rPr>
           <w:sz w:val="21"/>
         </w:rPr>
-        <w:t>18. Gudmundsson S, Thiele I. Computationally efficient flux variability analysis. BMC Bioinformatics. 2010;11:489.</w:t>
+        <w:t xml:space="preserve">18. Gudmundsson S, Thiele I. Computationally efficient flux variability analysis. BMC Bioinformatics. </w:t>
+      </w:r>
+      <w:proofErr w:type="gramStart"/>
+      <w:r>
+        <w:rPr>
+          <w:sz w:val="21"/>
+        </w:rPr>
+        <w:t>2010;11:489</w:t>
+      </w:r>
+      <w:proofErr w:type="gramEnd"/>
+      <w:r>
+        <w:rPr>
+          <w:sz w:val="21"/>
+        </w:rPr>
+        <w:t>.</w:t>
       </w:r>
     </w:p>
     <w:p>
@@ -13891,7 +16679,49 @@
         <w:rPr>
           <w:sz w:val="21"/>
         </w:rPr>
-        <w:t>19. Lewis NE, Hixson KK, Conrad TM, Lerman JA, Charusanti P, Polpitiya AD, et al. Omic data from evolved E. coli are consistent with computed optimal growth from genome-scale models. Molecular Systems Biology. 2010;6:390.</w:t>
+        <w:t xml:space="preserve">19. Lewis NE, Hixson KK, Conrad TM, Lerman JA, </w:t>
+      </w:r>
+      <w:proofErr w:type="spellStart"/>
+      <w:r>
+        <w:rPr>
+          <w:sz w:val="21"/>
+        </w:rPr>
+        <w:t>Charusanti</w:t>
+      </w:r>
+      <w:proofErr w:type="spellEnd"/>
+      <w:r>
+        <w:rPr>
+          <w:sz w:val="21"/>
+        </w:rPr>
+        <w:t xml:space="preserve"> P, </w:t>
+      </w:r>
+      <w:proofErr w:type="spellStart"/>
+      <w:r>
+        <w:rPr>
+          <w:sz w:val="21"/>
+        </w:rPr>
+        <w:t>Polpitiya</w:t>
+      </w:r>
+      <w:proofErr w:type="spellEnd"/>
+      <w:r>
+        <w:rPr>
+          <w:sz w:val="21"/>
+        </w:rPr>
+        <w:t xml:space="preserve"> AD, et al. Omic data from evolved E. coli are consistent with computed optimal growth from genome-scale models. Molecular Systems Biology. </w:t>
+      </w:r>
+      <w:proofErr w:type="gramStart"/>
+      <w:r>
+        <w:rPr>
+          <w:sz w:val="21"/>
+        </w:rPr>
+        <w:t>2010;6:390</w:t>
+      </w:r>
+      <w:proofErr w:type="gramEnd"/>
+      <w:r>
+        <w:rPr>
+          <w:sz w:val="21"/>
+        </w:rPr>
+        <w:t>.</w:t>
       </w:r>
     </w:p>
     <w:p>
@@ -13905,7 +16735,21 @@
           <w:sz w:val="21"/>
         </w:rPr>
         <w:lastRenderedPageBreak/>
-        <w:t>20. Burgard AP, Nikolaev EV, Schilling CH, Maranas CD. Flux coupling analysis of genome-scale metabolic network reconstructions. Genome Research. 2004;14(2):301–312.</w:t>
+        <w:t xml:space="preserve">20. Burgard AP, Nikolaev EV, Schilling CH, </w:t>
+      </w:r>
+      <w:proofErr w:type="spellStart"/>
+      <w:r>
+        <w:rPr>
+          <w:sz w:val="21"/>
+        </w:rPr>
+        <w:t>Maranas</w:t>
+      </w:r>
+      <w:proofErr w:type="spellEnd"/>
+      <w:r>
+        <w:rPr>
+          <w:sz w:val="21"/>
+        </w:rPr>
+        <w:t xml:space="preserve"> CD. Flux coupling analysis of genome-scale metabolic network reconstructions. Genome Research. 2004;14(2):301–312.</w:t>
       </w:r>
     </w:p>
     <w:p>
@@ -13931,7 +16775,21 @@
         <w:rPr>
           <w:sz w:val="21"/>
         </w:rPr>
-        <w:t>22. Papin JA, Stelling J, Price ND, Klamt S, Schuster S, Palsson BO. Comparison of network-based pathway analysis methods. Trends in Biotechnology. 2004;22(8):400–405.</w:t>
+        <w:t xml:space="preserve">22. Papin JA, Stelling J, Price ND, </w:t>
+      </w:r>
+      <w:proofErr w:type="spellStart"/>
+      <w:r>
+        <w:rPr>
+          <w:sz w:val="21"/>
+        </w:rPr>
+        <w:t>Klamt</w:t>
+      </w:r>
+      <w:proofErr w:type="spellEnd"/>
+      <w:r>
+        <w:rPr>
+          <w:sz w:val="21"/>
+        </w:rPr>
+        <w:t xml:space="preserve"> S, Schuster S, Palsson BO. Comparison of network-based pathway analysis methods. Trends in Biotechnology. 2004;22(8):400–405.</w:t>
       </w:r>
     </w:p>
     <w:p>
@@ -13957,7 +16815,21 @@
         <w:rPr>
           <w:sz w:val="21"/>
         </w:rPr>
-        <w:t>24. Henry CS, Broadbelt LJ, Hatzimanikatis V. Thermodynamics-based metabolic flux analysis. Biophysical Journal. 2007;92(5):1792–1805.</w:t>
+        <w:t xml:space="preserve">24. Henry CS, Broadbelt LJ, </w:t>
+      </w:r>
+      <w:proofErr w:type="spellStart"/>
+      <w:r>
+        <w:rPr>
+          <w:sz w:val="21"/>
+        </w:rPr>
+        <w:t>Hatzimanikatis</w:t>
+      </w:r>
+      <w:proofErr w:type="spellEnd"/>
+      <w:r>
+        <w:rPr>
+          <w:sz w:val="21"/>
+        </w:rPr>
+        <w:t xml:space="preserve"> V. Thermodynamics-based metabolic flux analysis. Biophysical Journal. 2007;92(5):1792–1805.</w:t>
       </w:r>
     </w:p>
     <w:p>
@@ -13970,7 +16842,21 @@
         <w:rPr>
           <w:sz w:val="21"/>
         </w:rPr>
-        <w:t>25. Noor E. Removing both internal and unrealistic energy-generating cycles in flux balance analysis. arXiv. 2018;1803.04999.</w:t>
+        <w:t xml:space="preserve">25. Noor E. Removing both internal and unrealistic energy-generating cycles in flux balance analysis. </w:t>
+      </w:r>
+      <w:proofErr w:type="spellStart"/>
+      <w:r>
+        <w:rPr>
+          <w:sz w:val="21"/>
+        </w:rPr>
+        <w:t>arXiv</w:t>
+      </w:r>
+      <w:proofErr w:type="spellEnd"/>
+      <w:r>
+        <w:rPr>
+          <w:sz w:val="21"/>
+        </w:rPr>
+        <w:t>. 2018;1803.04999.</w:t>
       </w:r>
     </w:p>
     <w:p>
@@ -14022,7 +16908,21 @@
         <w:rPr>
           <w:sz w:val="21"/>
         </w:rPr>
-        <w:t>29. Crown SB, Antoniewicz MR. Parallel labeling experiments and metabolic flux analysis: past, present and future methodologies. Metabolic Engineering. 2013;16:21–32.</w:t>
+        <w:t xml:space="preserve">29. Crown SB, Antoniewicz MR. Parallel labeling experiments and metabolic flux analysis: past, present and future methodologies. Metabolic Engineering. </w:t>
+      </w:r>
+      <w:proofErr w:type="gramStart"/>
+      <w:r>
+        <w:rPr>
+          <w:sz w:val="21"/>
+        </w:rPr>
+        <w:t>2013;16:21</w:t>
+      </w:r>
+      <w:proofErr w:type="gramEnd"/>
+      <w:r>
+        <w:rPr>
+          <w:sz w:val="21"/>
+        </w:rPr>
+        <w:t>–32.</w:t>
       </w:r>
     </w:p>
     <w:p>
@@ -14048,7 +16948,35 @@
         <w:rPr>
           <w:sz w:val="21"/>
         </w:rPr>
-        <w:t>31. Fernandez CA, Des Rosiers C, Previs SF, David F, Brunengraber H. Correction of ¹³C mass isotopomer distributions for natural stable isotope abundance. Journal of Mass Spectrometry. 1996;31(3):255–262.</w:t>
+        <w:t xml:space="preserve">31. Fernandez CA, Des </w:t>
+      </w:r>
+      <w:proofErr w:type="spellStart"/>
+      <w:r>
+        <w:rPr>
+          <w:sz w:val="21"/>
+        </w:rPr>
+        <w:t>Rosiers</w:t>
+      </w:r>
+      <w:proofErr w:type="spellEnd"/>
+      <w:r>
+        <w:rPr>
+          <w:sz w:val="21"/>
+        </w:rPr>
+        <w:t xml:space="preserve"> C, Previs SF, David F, </w:t>
+      </w:r>
+      <w:proofErr w:type="spellStart"/>
+      <w:r>
+        <w:rPr>
+          <w:sz w:val="21"/>
+        </w:rPr>
+        <w:t>Brunengraber</w:t>
+      </w:r>
+      <w:proofErr w:type="spellEnd"/>
+      <w:r>
+        <w:rPr>
+          <w:sz w:val="21"/>
+        </w:rPr>
+        <w:t xml:space="preserve"> H. Correction of ¹³C mass isotopomer distributions for natural stable isotope abundance. Journal of Mass Spectrometry. 1996;31(3):255–262.</w:t>
       </w:r>
     </w:p>
     <w:p>
@@ -14061,7 +16989,21 @@
         <w:rPr>
           <w:sz w:val="21"/>
         </w:rPr>
-        <w:t>32. van Winden WA, Wittmann C, Heinzle E, Heijnen JJ. Correcting mass isotopomer distributions for naturally occurring isotopes. Biotechnology and Bioengineering. 2002;80(4):477–479.</w:t>
+        <w:t xml:space="preserve">32. van Winden WA, Wittmann C, Heinzle E, </w:t>
+      </w:r>
+      <w:proofErr w:type="spellStart"/>
+      <w:r>
+        <w:rPr>
+          <w:sz w:val="21"/>
+        </w:rPr>
+        <w:t>Heijnen</w:t>
+      </w:r>
+      <w:proofErr w:type="spellEnd"/>
+      <w:r>
+        <w:rPr>
+          <w:sz w:val="21"/>
+        </w:rPr>
+        <w:t xml:space="preserve"> JJ. Correcting mass isotopomer distributions for naturally occurring isotopes. Biotechnology and Bioengineering. 2002;80(4):477–479.</w:t>
       </w:r>
     </w:p>
     <w:p>
@@ -14074,7 +17016,63 @@
         <w:rPr>
           <w:sz w:val="21"/>
         </w:rPr>
-        <w:t>33. Heinonen M, Osmala M, Mannerström H, Wallenius J, Kaski S, Rousu J, Lähdesmäki H. Bayesian metabolic flux analysis reveals intracellular flux couplings. Bioinformatics. 2019;35(14):i548–i557.</w:t>
+        <w:t xml:space="preserve">33. Heinonen M, </w:t>
+      </w:r>
+      <w:proofErr w:type="spellStart"/>
+      <w:r>
+        <w:rPr>
+          <w:sz w:val="21"/>
+        </w:rPr>
+        <w:t>Osmala</w:t>
+      </w:r>
+      <w:proofErr w:type="spellEnd"/>
+      <w:r>
+        <w:rPr>
+          <w:sz w:val="21"/>
+        </w:rPr>
+        <w:t xml:space="preserve"> M, </w:t>
+      </w:r>
+      <w:proofErr w:type="spellStart"/>
+      <w:r>
+        <w:rPr>
+          <w:sz w:val="21"/>
+        </w:rPr>
+        <w:t>Mannerström</w:t>
+      </w:r>
+      <w:proofErr w:type="spellEnd"/>
+      <w:r>
+        <w:rPr>
+          <w:sz w:val="21"/>
+        </w:rPr>
+        <w:t xml:space="preserve"> H, Wallenius J, Kaski S, Rousu J, </w:t>
+      </w:r>
+      <w:proofErr w:type="spellStart"/>
+      <w:r>
+        <w:rPr>
+          <w:sz w:val="21"/>
+        </w:rPr>
+        <w:t>Lähdesmäki</w:t>
+      </w:r>
+      <w:proofErr w:type="spellEnd"/>
+      <w:r>
+        <w:rPr>
+          <w:sz w:val="21"/>
+        </w:rPr>
+        <w:t xml:space="preserve"> H. Bayesian metabolic flux analysis reveals intracellular flux couplings. Bioinformatics. 2019;35(14</w:t>
+      </w:r>
+      <w:proofErr w:type="gramStart"/>
+      <w:r>
+        <w:rPr>
+          <w:sz w:val="21"/>
+        </w:rPr>
+        <w:t>):i</w:t>
+      </w:r>
+      <w:proofErr w:type="gramEnd"/>
+      <w:r>
+        <w:rPr>
+          <w:sz w:val="21"/>
+        </w:rPr>
+        <w:t>548–i557.</w:t>
       </w:r>
     </w:p>
     <w:p>
@@ -14100,7 +17098,35 @@
         <w:rPr>
           <w:sz w:val="21"/>
         </w:rPr>
-        <w:t>35. Chassagnole C, Noisommit-Rizzi N, Schmid JW, Mauch K, Reuss M. Dynamic modeling of the central carbon metabolism of Escherichia coli. Biotechnology and Bioengineering. 2002;79(1):53–73.</w:t>
+        <w:t xml:space="preserve">35. </w:t>
+      </w:r>
+      <w:proofErr w:type="spellStart"/>
+      <w:r>
+        <w:rPr>
+          <w:sz w:val="21"/>
+        </w:rPr>
+        <w:t>Chassagnole</w:t>
+      </w:r>
+      <w:proofErr w:type="spellEnd"/>
+      <w:r>
+        <w:rPr>
+          <w:sz w:val="21"/>
+        </w:rPr>
+        <w:t xml:space="preserve"> C, </w:t>
+      </w:r>
+      <w:proofErr w:type="spellStart"/>
+      <w:r>
+        <w:rPr>
+          <w:sz w:val="21"/>
+        </w:rPr>
+        <w:t>Noisommit</w:t>
+      </w:r>
+      <w:proofErr w:type="spellEnd"/>
+      <w:r>
+        <w:rPr>
+          <w:sz w:val="21"/>
+        </w:rPr>
+        <w:t>-Rizzi N, Schmid JW, Mauch K, Reuss M. Dynamic modeling of the central carbon metabolism of Escherichia coli. Biotechnology and Bioengineering. 2002;79(1):53–73.</w:t>
       </w:r>
     </w:p>
     <w:p>
@@ -14113,7 +17139,49 @@
         <w:rPr>
           <w:sz w:val="21"/>
         </w:rPr>
-        <w:t>36. Teusink B, Passarge J, Reijenga CA, Esgalhado E, van der Weijden CC, Schepper M, et al. Can yeast glycolysis be understood in terms of in vitro kinetics of the constituent enzymes? European Journal of Biochemistry. 2000;267(17):5313–5329.</w:t>
+        <w:t xml:space="preserve">36. Teusink B, Passarge J, </w:t>
+      </w:r>
+      <w:proofErr w:type="spellStart"/>
+      <w:r>
+        <w:rPr>
+          <w:sz w:val="21"/>
+        </w:rPr>
+        <w:t>Reijenga</w:t>
+      </w:r>
+      <w:proofErr w:type="spellEnd"/>
+      <w:r>
+        <w:rPr>
+          <w:sz w:val="21"/>
+        </w:rPr>
+        <w:t xml:space="preserve"> CA, </w:t>
+      </w:r>
+      <w:proofErr w:type="spellStart"/>
+      <w:r>
+        <w:rPr>
+          <w:sz w:val="21"/>
+        </w:rPr>
+        <w:t>Esgalhado</w:t>
+      </w:r>
+      <w:proofErr w:type="spellEnd"/>
+      <w:r>
+        <w:rPr>
+          <w:sz w:val="21"/>
+        </w:rPr>
+        <w:t xml:space="preserve"> E, van der </w:t>
+      </w:r>
+      <w:proofErr w:type="spellStart"/>
+      <w:r>
+        <w:rPr>
+          <w:sz w:val="21"/>
+        </w:rPr>
+        <w:t>Weijden</w:t>
+      </w:r>
+      <w:proofErr w:type="spellEnd"/>
+      <w:r>
+        <w:rPr>
+          <w:sz w:val="21"/>
+        </w:rPr>
+        <w:t xml:space="preserve"> CC, Schepper M, et al. Can yeast glycolysis be understood in terms of in vitro kinetics of the constituent enzymes? European Journal of Biochemistry. 2000;267(17):5313–5329.</w:t>
       </w:r>
     </w:p>
     <w:p>
@@ -14126,7 +17194,35 @@
         <w:rPr>
           <w:sz w:val="21"/>
         </w:rPr>
-        <w:t>37. Kacser H, Burns JA. The control of flux. Symposia of the Society for Experimental Biology. 1973;27:65–104.</w:t>
+        <w:t xml:space="preserve">37. </w:t>
+      </w:r>
+      <w:proofErr w:type="spellStart"/>
+      <w:r>
+        <w:rPr>
+          <w:sz w:val="21"/>
+        </w:rPr>
+        <w:t>Kacser</w:t>
+      </w:r>
+      <w:proofErr w:type="spellEnd"/>
+      <w:r>
+        <w:rPr>
+          <w:sz w:val="21"/>
+        </w:rPr>
+        <w:t xml:space="preserve"> H, Burns JA. The control of flux. Symposia of the Society for Experimental Biology. </w:t>
+      </w:r>
+      <w:proofErr w:type="gramStart"/>
+      <w:r>
+        <w:rPr>
+          <w:sz w:val="21"/>
+        </w:rPr>
+        <w:t>1973;27:65</w:t>
+      </w:r>
+      <w:proofErr w:type="gramEnd"/>
+      <w:r>
+        <w:rPr>
+          <w:sz w:val="21"/>
+        </w:rPr>
+        <w:t>–104.</w:t>
       </w:r>
     </w:p>
     <w:p>
@@ -14152,7 +17248,21 @@
         <w:rPr>
           <w:sz w:val="21"/>
         </w:rPr>
-        <w:t>39. Sánchez BJ, Zhang C, Nilsson A, Lahtvee PJ, Kerkhoven EJ, Nielsen J. Improving the phenotype predictions of a yeast genome-scale metabolic model by incorporating enzymatic constraints. Molecular Systems Biology. 2017;13(8):935.</w:t>
+        <w:t xml:space="preserve">39. Sánchez BJ, Zhang C, Nilsson A, </w:t>
+      </w:r>
+      <w:proofErr w:type="spellStart"/>
+      <w:r>
+        <w:rPr>
+          <w:sz w:val="21"/>
+        </w:rPr>
+        <w:t>Lahtvee</w:t>
+      </w:r>
+      <w:proofErr w:type="spellEnd"/>
+      <w:r>
+        <w:rPr>
+          <w:sz w:val="21"/>
+        </w:rPr>
+        <w:t xml:space="preserve"> PJ, Kerkhoven EJ, Nielsen J. Improving the phenotype predictions of a yeast genome-scale metabolic model by incorporating enzymatic constraints. Molecular Systems Biology. 2017;13(8):935.</w:t>
       </w:r>
     </w:p>
     <w:p>
@@ -14166,7 +17276,49 @@
           <w:sz w:val="21"/>
         </w:rPr>
         <w:lastRenderedPageBreak/>
-        <w:t>40. Adadi R, Volkmer B, Milo R, Heinemann M, Shlomi T. Prediction of microbial growth rate versus biomass yield by a metabolic network with kinetic parameters. PLoS Computational Biology. 2012;8(7):e1002575.</w:t>
+        <w:t xml:space="preserve">40. </w:t>
+      </w:r>
+      <w:proofErr w:type="spellStart"/>
+      <w:r>
+        <w:rPr>
+          <w:sz w:val="21"/>
+        </w:rPr>
+        <w:t>Adadi</w:t>
+      </w:r>
+      <w:proofErr w:type="spellEnd"/>
+      <w:r>
+        <w:rPr>
+          <w:sz w:val="21"/>
+        </w:rPr>
+        <w:t xml:space="preserve"> R, Volkmer B, Milo R, Heinemann M, Shlomi T. Prediction of microbial growth rate versus biomass yield by a metabolic network with kinetic parameters. </w:t>
+      </w:r>
+      <w:proofErr w:type="spellStart"/>
+      <w:r>
+        <w:rPr>
+          <w:sz w:val="21"/>
+        </w:rPr>
+        <w:t>PLoS</w:t>
+      </w:r>
+      <w:proofErr w:type="spellEnd"/>
+      <w:r>
+        <w:rPr>
+          <w:sz w:val="21"/>
+        </w:rPr>
+        <w:t xml:space="preserve"> Computational Biology. 2012;8(7</w:t>
+      </w:r>
+      <w:proofErr w:type="gramStart"/>
+      <w:r>
+        <w:rPr>
+          <w:sz w:val="21"/>
+        </w:rPr>
+        <w:t>):e</w:t>
+      </w:r>
+      <w:proofErr w:type="gramEnd"/>
+      <w:r>
+        <w:rPr>
+          <w:sz w:val="21"/>
+        </w:rPr>
+        <w:t>1002575.</w:t>
       </w:r>
     </w:p>
     <w:p>
@@ -14179,7 +17331,21 @@
         <w:rPr>
           <w:sz w:val="21"/>
         </w:rPr>
-        <w:t>41. O’Brien EJ, Lerman JA, Chang RL, Hyduke DR, Palsson BO. Genome-scale models of metabolism and gene expression extend and refine growth phenotype prediction. Molecular Systems Biology. 2013;9:693.</w:t>
+        <w:t xml:space="preserve">41. O’Brien EJ, Lerman JA, Chang RL, Hyduke DR, Palsson BO. Genome-scale models of metabolism and gene expression extend and refine growth phenotype prediction. Molecular Systems Biology. </w:t>
+      </w:r>
+      <w:proofErr w:type="gramStart"/>
+      <w:r>
+        <w:rPr>
+          <w:sz w:val="21"/>
+        </w:rPr>
+        <w:t>2013;9:693</w:t>
+      </w:r>
+      <w:proofErr w:type="gramEnd"/>
+      <w:r>
+        <w:rPr>
+          <w:sz w:val="21"/>
+        </w:rPr>
+        <w:t>.</w:t>
       </w:r>
     </w:p>
     <w:p>
@@ -14192,7 +17358,35 @@
         <w:rPr>
           <w:sz w:val="21"/>
         </w:rPr>
-        <w:t>42. Salvy P, Hatzimanikatis V. The ETFL formulation allows multi-omics integration in thermodynamics-compliant metabolism and expression models. Nature Communications. 2020;11:30.</w:t>
+        <w:t xml:space="preserve">42. Salvy P, </w:t>
+      </w:r>
+      <w:proofErr w:type="spellStart"/>
+      <w:r>
+        <w:rPr>
+          <w:sz w:val="21"/>
+        </w:rPr>
+        <w:t>Hatzimanikatis</w:t>
+      </w:r>
+      <w:proofErr w:type="spellEnd"/>
+      <w:r>
+        <w:rPr>
+          <w:sz w:val="21"/>
+        </w:rPr>
+        <w:t xml:space="preserve"> V. The ETFL formulation allows multi-omics integration in thermodynamics-compliant metabolism and expression models. Nature Communications. </w:t>
+      </w:r>
+      <w:proofErr w:type="gramStart"/>
+      <w:r>
+        <w:rPr>
+          <w:sz w:val="21"/>
+        </w:rPr>
+        <w:t>2020;11:30</w:t>
+      </w:r>
+      <w:proofErr w:type="gramEnd"/>
+      <w:r>
+        <w:rPr>
+          <w:sz w:val="21"/>
+        </w:rPr>
+        <w:t>.</w:t>
       </w:r>
     </w:p>
     <w:p>
@@ -14205,7 +17399,35 @@
         <w:rPr>
           <w:sz w:val="21"/>
         </w:rPr>
-        <w:t>43. Ebrahim A, Lerman JA, Palsson BO, Hyduke DR. COBRApy: constraints-based reconstruction and analysis for Python. BMC Systems Biology. 2013;7:74.</w:t>
+        <w:t xml:space="preserve">43. Ebrahim A, Lerman JA, Palsson BO, Hyduke DR. </w:t>
+      </w:r>
+      <w:proofErr w:type="spellStart"/>
+      <w:r>
+        <w:rPr>
+          <w:sz w:val="21"/>
+        </w:rPr>
+        <w:t>COBRApy</w:t>
+      </w:r>
+      <w:proofErr w:type="spellEnd"/>
+      <w:r>
+        <w:rPr>
+          <w:sz w:val="21"/>
+        </w:rPr>
+        <w:t xml:space="preserve">: constraints-based reconstruction and analysis for Python. BMC Systems Biology. </w:t>
+      </w:r>
+      <w:proofErr w:type="gramStart"/>
+      <w:r>
+        <w:rPr>
+          <w:sz w:val="21"/>
+        </w:rPr>
+        <w:t>2013;7:74</w:t>
+      </w:r>
+      <w:proofErr w:type="gramEnd"/>
+      <w:r>
+        <w:rPr>
+          <w:sz w:val="21"/>
+        </w:rPr>
+        <w:t>.</w:t>
       </w:r>
     </w:p>
     <w:p>
@@ -14218,7 +17440,49 @@
         <w:rPr>
           <w:sz w:val="21"/>
         </w:rPr>
-        <w:t>44. Heirendt L, Arreckx S, Pfau T, Mendoza SN, Richelle A, Heinken A, et al. Creation and analysis of biochemical constraint-based models using the COBRA Toolbox v.3.0. Nature Protocols. 2019;14:639–702.</w:t>
+        <w:t xml:space="preserve">44. Heirendt L, </w:t>
+      </w:r>
+      <w:proofErr w:type="spellStart"/>
+      <w:r>
+        <w:rPr>
+          <w:sz w:val="21"/>
+        </w:rPr>
+        <w:t>Arreckx</w:t>
+      </w:r>
+      <w:proofErr w:type="spellEnd"/>
+      <w:r>
+        <w:rPr>
+          <w:sz w:val="21"/>
+        </w:rPr>
+        <w:t xml:space="preserve"> S, Pfau T, Mendoza SN, Richelle A, </w:t>
+      </w:r>
+      <w:proofErr w:type="spellStart"/>
+      <w:r>
+        <w:rPr>
+          <w:sz w:val="21"/>
+        </w:rPr>
+        <w:t>Heinken</w:t>
+      </w:r>
+      <w:proofErr w:type="spellEnd"/>
+      <w:r>
+        <w:rPr>
+          <w:sz w:val="21"/>
+        </w:rPr>
+        <w:t xml:space="preserve"> A, et al. Creation and analysis of biochemical constraint-based models using the COBRA Toolbox v.3.0. Nature Protocols. </w:t>
+      </w:r>
+      <w:proofErr w:type="gramStart"/>
+      <w:r>
+        <w:rPr>
+          <w:sz w:val="21"/>
+        </w:rPr>
+        <w:t>2019;14:639</w:t>
+      </w:r>
+      <w:proofErr w:type="gramEnd"/>
+      <w:r>
+        <w:rPr>
+          <w:sz w:val="21"/>
+        </w:rPr>
+        <w:t>–702.</w:t>
       </w:r>
     </w:p>
     <w:p>
@@ -14231,14 +17495,44 @@
         <w:rPr>
           <w:sz w:val="21"/>
         </w:rPr>
-        <w:t>45. King ZA, Lu J, Dräger A, Miller P, Federowicz S, Lerman JA, et al. BiGG Models: A platform for integrating, standardizing and sharing genome-scale models. Nucleic Acids Research. 2016;44(D1):D515–D522.</w:t>
+        <w:t xml:space="preserve">45. King ZA, Lu J, Dräger A, Miller P, Federowicz S, Lerman JA, et al. </w:t>
+      </w:r>
+      <w:proofErr w:type="spellStart"/>
+      <w:r>
+        <w:rPr>
+          <w:sz w:val="21"/>
+        </w:rPr>
+        <w:t>BiGG</w:t>
+      </w:r>
+      <w:proofErr w:type="spellEnd"/>
+      <w:r>
+        <w:rPr>
+          <w:sz w:val="21"/>
+        </w:rPr>
+        <w:t xml:space="preserve"> Models: A platform for integrating, standardizing and sharing genome-scale models. Nucleic Acids Research. 2016;44(D1</w:t>
+      </w:r>
+      <w:proofErr w:type="gramStart"/>
+      <w:r>
+        <w:rPr>
+          <w:sz w:val="21"/>
+        </w:rPr>
+        <w:t>):D</w:t>
+      </w:r>
+      <w:proofErr w:type="gramEnd"/>
+      <w:r>
+        <w:rPr>
+          <w:sz w:val="21"/>
+        </w:rPr>
+        <w:t>515–D522.</w:t>
       </w:r>
     </w:p>
     <w:sectPr>
-      <w:footerReference w:type="default" r:id="rId8"/>
+      <w:footerReference w:type="default" r:id="rId10"/>
       <w:pgSz w:w="11906" w:h="16838"/>
       <w:pgMar w:top="1417" w:right="1304" w:bottom="1417" w:left="1531" w:header="720" w:footer="720" w:gutter="0"/>
+      <w:pgNumType w:start="0"/>
       <w:cols w:space="720"/>
+      <w:titlePg/>
       <w:docGrid w:linePitch="360"/>
     </w:sectPr>
   </w:body>
@@ -15138,7 +18432,6 @@
   <w:style w:type="character" w:default="1" w:styleId="DefaultParagraphFont">
     <w:name w:val="Default Paragraph Font"/>
     <w:uiPriority w:val="1"/>
-    <w:semiHidden/>
     <w:unhideWhenUsed/>
   </w:style>
   <w:style w:type="table" w:default="1" w:styleId="TableNormal">
@@ -15208,6 +18501,7 @@
   </w:style>
   <w:style w:type="paragraph" w:styleId="NoSpacing">
     <w:name w:val="No Spacing"/>
+    <w:link w:val="NoSpacingChar"/>
     <w:uiPriority w:val="1"/>
     <w:qFormat/>
     <w:rsid w:val="00FC693F"/>
@@ -25906,6 +29200,36 @@
       </w:tcPr>
     </w:tblStylePr>
   </w:style>
+  <w:style w:type="character" w:customStyle="1" w:styleId="NoSpacingChar">
+    <w:name w:val="No Spacing Char"/>
+    <w:basedOn w:val="DefaultParagraphFont"/>
+    <w:link w:val="NoSpacing"/>
+    <w:uiPriority w:val="1"/>
+    <w:rsid w:val="00D24218"/>
+  </w:style>
+  <w:style w:type="character" w:styleId="Hyperlink">
+    <w:name w:val="Hyperlink"/>
+    <w:basedOn w:val="DefaultParagraphFont"/>
+    <w:uiPriority w:val="99"/>
+    <w:unhideWhenUsed/>
+    <w:rsid w:val="006569F1"/>
+    <w:rPr>
+      <w:color w:val="0000FF" w:themeColor="hyperlink"/>
+      <w:u w:val="single"/>
+    </w:rPr>
+  </w:style>
+  <w:style w:type="character" w:styleId="UnresolvedMention">
+    <w:name w:val="Unresolved Mention"/>
+    <w:basedOn w:val="DefaultParagraphFont"/>
+    <w:uiPriority w:val="99"/>
+    <w:semiHidden/>
+    <w:unhideWhenUsed/>
+    <w:rsid w:val="006569F1"/>
+    <w:rPr>
+      <w:color w:val="605E5C"/>
+      <w:shd w:val="clear" w:color="auto" w:fill="E1DFDD"/>
+    </w:rPr>
+  </w:style>
 </w:styles>
 </file>
 

</xml_diff>